<commit_message>
Explicaciones http4s, IO, Ember, Blaze, etc.
</commit_message>
<xml_diff>
--- a/newDocumentation/Memoria.docx
+++ b/newDocumentation/Memoria.docx
@@ -455,7 +455,7 @@
           <w:numId w:val="0"/>
         </w:numPr>
       </w:pPr>
-      <w:bookmarkStart w:id="1" w:name="_Toc200610044"/>
+      <w:bookmarkStart w:id="1" w:name="_Toc200708260"/>
       <w:r>
         <w:lastRenderedPageBreak/>
         <w:t>Resumen</w:t>
@@ -475,7 +475,7 @@
           <w:numId w:val="0"/>
         </w:numPr>
       </w:pPr>
-      <w:bookmarkStart w:id="2" w:name="_Toc200610045"/>
+      <w:bookmarkStart w:id="2" w:name="_Toc200708261"/>
       <w:r>
         <w:t>Palabras clave</w:t>
       </w:r>
@@ -502,7 +502,7 @@
     <w:p/>
     <w:p/>
     <w:p/>
-    <w:bookmarkStart w:id="3" w:name="_Toc200610046" w:displacedByCustomXml="next"/>
+    <w:bookmarkStart w:id="3" w:name="_Toc200708262" w:displacedByCustomXml="next"/>
     <w:sdt>
       <w:sdtPr>
         <w:rPr>
@@ -562,7 +562,7 @@
           <w:r>
             <w:fldChar w:fldCharType="separate"/>
           </w:r>
-          <w:hyperlink w:anchor="_Toc200610044" w:history="1">
+          <w:hyperlink w:anchor="_Toc200708260" w:history="1">
             <w:r>
               <w:rPr>
                 <w:rStyle w:val="Hipervnculo"/>
@@ -589,7 +589,7 @@
                 <w:noProof/>
                 <w:webHidden/>
               </w:rPr>
-              <w:instrText xml:space="preserve"> PAGEREF _Toc200610044 \h </w:instrText>
+              <w:instrText xml:space="preserve"> PAGEREF _Toc200708260 \h </w:instrText>
             </w:r>
             <w:r>
               <w:rPr>
@@ -635,7 +635,7 @@
               <w14:ligatures w14:val="standardContextual"/>
             </w:rPr>
           </w:pPr>
-          <w:hyperlink w:anchor="_Toc200610045" w:history="1">
+          <w:hyperlink w:anchor="_Toc200708261" w:history="1">
             <w:r>
               <w:rPr>
                 <w:rStyle w:val="Hipervnculo"/>
@@ -662,7 +662,7 @@
                 <w:noProof/>
                 <w:webHidden/>
               </w:rPr>
-              <w:instrText xml:space="preserve"> PAGEREF _Toc200610045 \h </w:instrText>
+              <w:instrText xml:space="preserve"> PAGEREF _Toc200708261 \h </w:instrText>
             </w:r>
             <w:r>
               <w:rPr>
@@ -708,7 +708,7 @@
               <w14:ligatures w14:val="standardContextual"/>
             </w:rPr>
           </w:pPr>
-          <w:hyperlink w:anchor="_Toc200610046" w:history="1">
+          <w:hyperlink w:anchor="_Toc200708262" w:history="1">
             <w:r>
               <w:rPr>
                 <w:rStyle w:val="Hipervnculo"/>
@@ -735,7 +735,7 @@
                 <w:noProof/>
                 <w:webHidden/>
               </w:rPr>
-              <w:instrText xml:space="preserve"> PAGEREF _Toc200610046 \h </w:instrText>
+              <w:instrText xml:space="preserve"> PAGEREF _Toc200708262 \h </w:instrText>
             </w:r>
             <w:r>
               <w:rPr>
@@ -781,7 +781,7 @@
               <w14:ligatures w14:val="standardContextual"/>
             </w:rPr>
           </w:pPr>
-          <w:hyperlink w:anchor="_Toc200610047" w:history="1">
+          <w:hyperlink w:anchor="_Toc200708263" w:history="1">
             <w:r>
               <w:rPr>
                 <w:rStyle w:val="Hipervnculo"/>
@@ -808,7 +808,7 @@
                 <w:noProof/>
                 <w:webHidden/>
               </w:rPr>
-              <w:instrText xml:space="preserve"> PAGEREF _Toc200610047 \h </w:instrText>
+              <w:instrText xml:space="preserve"> PAGEREF _Toc200708263 \h </w:instrText>
             </w:r>
             <w:r>
               <w:rPr>
@@ -855,7 +855,7 @@
               <w14:ligatures w14:val="standardContextual"/>
             </w:rPr>
           </w:pPr>
-          <w:hyperlink w:anchor="_Toc200610048" w:history="1">
+          <w:hyperlink w:anchor="_Toc200708264" w:history="1">
             <w:r>
               <w:rPr>
                 <w:rStyle w:val="Hipervnculo"/>
@@ -900,7 +900,7 @@
                 <w:noProof/>
                 <w:webHidden/>
               </w:rPr>
-              <w:instrText xml:space="preserve"> PAGEREF _Toc200610048 \h </w:instrText>
+              <w:instrText xml:space="preserve"> PAGEREF _Toc200708264 \h </w:instrText>
             </w:r>
             <w:r>
               <w:rPr>
@@ -947,7 +947,7 @@
               <w14:ligatures w14:val="standardContextual"/>
             </w:rPr>
           </w:pPr>
-          <w:hyperlink w:anchor="_Toc200610049" w:history="1">
+          <w:hyperlink w:anchor="_Toc200708265" w:history="1">
             <w:r>
               <w:rPr>
                 <w:rStyle w:val="Hipervnculo"/>
@@ -992,7 +992,7 @@
                 <w:noProof/>
                 <w:webHidden/>
               </w:rPr>
-              <w:instrText xml:space="preserve"> PAGEREF _Toc200610049 \h </w:instrText>
+              <w:instrText xml:space="preserve"> PAGEREF _Toc200708265 \h </w:instrText>
             </w:r>
             <w:r>
               <w:rPr>
@@ -1039,7 +1039,7 @@
               <w14:ligatures w14:val="standardContextual"/>
             </w:rPr>
           </w:pPr>
-          <w:hyperlink w:anchor="_Toc200610050" w:history="1">
+          <w:hyperlink w:anchor="_Toc200708266" w:history="1">
             <w:r>
               <w:rPr>
                 <w:rStyle w:val="Hipervnculo"/>
@@ -1084,7 +1084,7 @@
                 <w:noProof/>
                 <w:webHidden/>
               </w:rPr>
-              <w:instrText xml:space="preserve"> PAGEREF _Toc200610050 \h </w:instrText>
+              <w:instrText xml:space="preserve"> PAGEREF _Toc200708266 \h </w:instrText>
             </w:r>
             <w:r>
               <w:rPr>
@@ -1131,7 +1131,7 @@
               <w14:ligatures w14:val="standardContextual"/>
             </w:rPr>
           </w:pPr>
-          <w:hyperlink w:anchor="_Toc200610051" w:history="1">
+          <w:hyperlink w:anchor="_Toc200708267" w:history="1">
             <w:r>
               <w:rPr>
                 <w:rStyle w:val="Hipervnculo"/>
@@ -1176,7 +1176,7 @@
                 <w:noProof/>
                 <w:webHidden/>
               </w:rPr>
-              <w:instrText xml:space="preserve"> PAGEREF _Toc200610051 \h </w:instrText>
+              <w:instrText xml:space="preserve"> PAGEREF _Toc200708267 \h </w:instrText>
             </w:r>
             <w:r>
               <w:rPr>
@@ -1223,7 +1223,7 @@
               <w14:ligatures w14:val="standardContextual"/>
             </w:rPr>
           </w:pPr>
-          <w:hyperlink w:anchor="_Toc200610052" w:history="1">
+          <w:hyperlink w:anchor="_Toc200708268" w:history="1">
             <w:r>
               <w:rPr>
                 <w:rStyle w:val="Hipervnculo"/>
@@ -1268,7 +1268,7 @@
                 <w:noProof/>
                 <w:webHidden/>
               </w:rPr>
-              <w:instrText xml:space="preserve"> PAGEREF _Toc200610052 \h </w:instrText>
+              <w:instrText xml:space="preserve"> PAGEREF _Toc200708268 \h </w:instrText>
             </w:r>
             <w:r>
               <w:rPr>
@@ -1315,7 +1315,7 @@
               <w14:ligatures w14:val="standardContextual"/>
             </w:rPr>
           </w:pPr>
-          <w:hyperlink w:anchor="_Toc200610053" w:history="1">
+          <w:hyperlink w:anchor="_Toc200708269" w:history="1">
             <w:r>
               <w:rPr>
                 <w:rStyle w:val="Hipervnculo"/>
@@ -1360,7 +1360,7 @@
                 <w:noProof/>
                 <w:webHidden/>
               </w:rPr>
-              <w:instrText xml:space="preserve"> PAGEREF _Toc200610053 \h </w:instrText>
+              <w:instrText xml:space="preserve"> PAGEREF _Toc200708269 \h </w:instrText>
             </w:r>
             <w:r>
               <w:rPr>
@@ -1407,7 +1407,7 @@
               <w14:ligatures w14:val="standardContextual"/>
             </w:rPr>
           </w:pPr>
-          <w:hyperlink w:anchor="_Toc200610054" w:history="1">
+          <w:hyperlink w:anchor="_Toc200708270" w:history="1">
             <w:r>
               <w:rPr>
                 <w:rStyle w:val="Hipervnculo"/>
@@ -1452,7 +1452,7 @@
                 <w:noProof/>
                 <w:webHidden/>
               </w:rPr>
-              <w:instrText xml:space="preserve"> PAGEREF _Toc200610054 \h </w:instrText>
+              <w:instrText xml:space="preserve"> PAGEREF _Toc200708270 \h </w:instrText>
             </w:r>
             <w:r>
               <w:rPr>
@@ -1499,7 +1499,7 @@
               <w14:ligatures w14:val="standardContextual"/>
             </w:rPr>
           </w:pPr>
-          <w:hyperlink w:anchor="_Toc200610055" w:history="1">
+          <w:hyperlink w:anchor="_Toc200708271" w:history="1">
             <w:r>
               <w:rPr>
                 <w:rStyle w:val="Hipervnculo"/>
@@ -1544,7 +1544,7 @@
                 <w:noProof/>
                 <w:webHidden/>
               </w:rPr>
-              <w:instrText xml:space="preserve"> PAGEREF _Toc200610055 \h </w:instrText>
+              <w:instrText xml:space="preserve"> PAGEREF _Toc200708271 \h </w:instrText>
             </w:r>
             <w:r>
               <w:rPr>
@@ -1591,7 +1591,7 @@
               <w14:ligatures w14:val="standardContextual"/>
             </w:rPr>
           </w:pPr>
-          <w:hyperlink w:anchor="_Toc200610056" w:history="1">
+          <w:hyperlink w:anchor="_Toc200708272" w:history="1">
             <w:r>
               <w:rPr>
                 <w:rStyle w:val="Hipervnculo"/>
@@ -1636,7 +1636,7 @@
                 <w:noProof/>
                 <w:webHidden/>
               </w:rPr>
-              <w:instrText xml:space="preserve"> PAGEREF _Toc200610056 \h </w:instrText>
+              <w:instrText xml:space="preserve"> PAGEREF _Toc200708272 \h </w:instrText>
             </w:r>
             <w:r>
               <w:rPr>
@@ -1683,7 +1683,7 @@
               <w14:ligatures w14:val="standardContextual"/>
             </w:rPr>
           </w:pPr>
-          <w:hyperlink w:anchor="_Toc200610057" w:history="1">
+          <w:hyperlink w:anchor="_Toc200708273" w:history="1">
             <w:r>
               <w:rPr>
                 <w:rStyle w:val="Hipervnculo"/>
@@ -1728,7 +1728,7 @@
                 <w:noProof/>
                 <w:webHidden/>
               </w:rPr>
-              <w:instrText xml:space="preserve"> PAGEREF _Toc200610057 \h </w:instrText>
+              <w:instrText xml:space="preserve"> PAGEREF _Toc200708273 \h </w:instrText>
             </w:r>
             <w:r>
               <w:rPr>
@@ -1775,7 +1775,7 @@
               <w14:ligatures w14:val="standardContextual"/>
             </w:rPr>
           </w:pPr>
-          <w:hyperlink w:anchor="_Toc200610058" w:history="1">
+          <w:hyperlink w:anchor="_Toc200708274" w:history="1">
             <w:r>
               <w:rPr>
                 <w:rStyle w:val="Hipervnculo"/>
@@ -1820,7 +1820,7 @@
                 <w:noProof/>
                 <w:webHidden/>
               </w:rPr>
-              <w:instrText xml:space="preserve"> PAGEREF _Toc200610058 \h </w:instrText>
+              <w:instrText xml:space="preserve"> PAGEREF _Toc200708274 \h </w:instrText>
             </w:r>
             <w:r>
               <w:rPr>
@@ -1840,7 +1840,7 @@
                 <w:noProof/>
                 <w:webHidden/>
               </w:rPr>
-              <w:t>32</w:t>
+              <w:t>33</w:t>
             </w:r>
             <w:r>
               <w:rPr>
@@ -1867,7 +1867,7 @@
               <w14:ligatures w14:val="standardContextual"/>
             </w:rPr>
           </w:pPr>
-          <w:hyperlink w:anchor="_Toc200610059" w:history="1">
+          <w:hyperlink w:anchor="_Toc200708275" w:history="1">
             <w:r>
               <w:rPr>
                 <w:rStyle w:val="Hipervnculo"/>
@@ -1912,7 +1912,7 @@
                 <w:noProof/>
                 <w:webHidden/>
               </w:rPr>
-              <w:instrText xml:space="preserve"> PAGEREF _Toc200610059 \h </w:instrText>
+              <w:instrText xml:space="preserve"> PAGEREF _Toc200708275 \h </w:instrText>
             </w:r>
             <w:r>
               <w:rPr>
@@ -1932,7 +1932,7 @@
                 <w:noProof/>
                 <w:webHidden/>
               </w:rPr>
-              <w:t>32</w:t>
+              <w:t>33</w:t>
             </w:r>
             <w:r>
               <w:rPr>
@@ -1959,7 +1959,7 @@
               <w14:ligatures w14:val="standardContextual"/>
             </w:rPr>
           </w:pPr>
-          <w:hyperlink w:anchor="_Toc200610060" w:history="1">
+          <w:hyperlink w:anchor="_Toc200708276" w:history="1">
             <w:r>
               <w:rPr>
                 <w:rStyle w:val="Hipervnculo"/>
@@ -2004,7 +2004,7 @@
                 <w:noProof/>
                 <w:webHidden/>
               </w:rPr>
-              <w:instrText xml:space="preserve"> PAGEREF _Toc200610060 \h </w:instrText>
+              <w:instrText xml:space="preserve"> PAGEREF _Toc200708276 \h </w:instrText>
             </w:r>
             <w:r>
               <w:rPr>
@@ -2051,7 +2051,7 @@
               <w14:ligatures w14:val="standardContextual"/>
             </w:rPr>
           </w:pPr>
-          <w:hyperlink w:anchor="_Toc200610061" w:history="1">
+          <w:hyperlink w:anchor="_Toc200708277" w:history="1">
             <w:r>
               <w:rPr>
                 <w:rStyle w:val="Hipervnculo"/>
@@ -2096,7 +2096,7 @@
                 <w:noProof/>
                 <w:webHidden/>
               </w:rPr>
-              <w:instrText xml:space="preserve"> PAGEREF _Toc200610061 \h </w:instrText>
+              <w:instrText xml:space="preserve"> PAGEREF _Toc200708277 \h </w:instrText>
             </w:r>
             <w:r>
               <w:rPr>
@@ -2116,7 +2116,7 @@
                 <w:noProof/>
                 <w:webHidden/>
               </w:rPr>
-              <w:t>35</w:t>
+              <w:t>36</w:t>
             </w:r>
             <w:r>
               <w:rPr>
@@ -2143,7 +2143,7 @@
               <w14:ligatures w14:val="standardContextual"/>
             </w:rPr>
           </w:pPr>
-          <w:hyperlink w:anchor="_Toc200610062" w:history="1">
+          <w:hyperlink w:anchor="_Toc200708278" w:history="1">
             <w:r>
               <w:rPr>
                 <w:rStyle w:val="Hipervnculo"/>
@@ -2188,7 +2188,7 @@
                 <w:noProof/>
                 <w:webHidden/>
               </w:rPr>
-              <w:instrText xml:space="preserve"> PAGEREF _Toc200610062 \h </w:instrText>
+              <w:instrText xml:space="preserve"> PAGEREF _Toc200708278 \h </w:instrText>
             </w:r>
             <w:r>
               <w:rPr>
@@ -2235,7 +2235,7 @@
               <w14:ligatures w14:val="standardContextual"/>
             </w:rPr>
           </w:pPr>
-          <w:hyperlink w:anchor="_Toc200610063" w:history="1">
+          <w:hyperlink w:anchor="_Toc200708279" w:history="1">
             <w:r>
               <w:rPr>
                 <w:rStyle w:val="Hipervnculo"/>
@@ -2280,7 +2280,7 @@
                 <w:noProof/>
                 <w:webHidden/>
               </w:rPr>
-              <w:instrText xml:space="preserve"> PAGEREF _Toc200610063 \h </w:instrText>
+              <w:instrText xml:space="preserve"> PAGEREF _Toc200708279 \h </w:instrText>
             </w:r>
             <w:r>
               <w:rPr>
@@ -2300,7 +2300,7 @@
                 <w:noProof/>
                 <w:webHidden/>
               </w:rPr>
-              <w:t>39</w:t>
+              <w:t>40</w:t>
             </w:r>
             <w:r>
               <w:rPr>
@@ -2327,7 +2327,7 @@
               <w14:ligatures w14:val="standardContextual"/>
             </w:rPr>
           </w:pPr>
-          <w:hyperlink w:anchor="_Toc200610064" w:history="1">
+          <w:hyperlink w:anchor="_Toc200708280" w:history="1">
             <w:r>
               <w:rPr>
                 <w:rStyle w:val="Hipervnculo"/>
@@ -2372,7 +2372,7 @@
                 <w:noProof/>
                 <w:webHidden/>
               </w:rPr>
-              <w:instrText xml:space="preserve"> PAGEREF _Toc200610064 \h </w:instrText>
+              <w:instrText xml:space="preserve"> PAGEREF _Toc200708280 \h </w:instrText>
             </w:r>
             <w:r>
               <w:rPr>
@@ -2392,7 +2392,7 @@
                 <w:noProof/>
                 <w:webHidden/>
               </w:rPr>
-              <w:t>41</w:t>
+              <w:t>44</w:t>
             </w:r>
             <w:r>
               <w:rPr>
@@ -2419,7 +2419,7 @@
               <w14:ligatures w14:val="standardContextual"/>
             </w:rPr>
           </w:pPr>
-          <w:hyperlink w:anchor="_Toc200610065" w:history="1">
+          <w:hyperlink w:anchor="_Toc200708281" w:history="1">
             <w:r>
               <w:rPr>
                 <w:rStyle w:val="Hipervnculo"/>
@@ -2464,7 +2464,7 @@
                 <w:noProof/>
                 <w:webHidden/>
               </w:rPr>
-              <w:instrText xml:space="preserve"> PAGEREF _Toc200610065 \h </w:instrText>
+              <w:instrText xml:space="preserve"> PAGEREF _Toc200708281 \h </w:instrText>
             </w:r>
             <w:r>
               <w:rPr>
@@ -2484,7 +2484,7 @@
                 <w:noProof/>
                 <w:webHidden/>
               </w:rPr>
-              <w:t>41</w:t>
+              <w:t>44</w:t>
             </w:r>
             <w:r>
               <w:rPr>
@@ -2511,7 +2511,7 @@
               <w14:ligatures w14:val="standardContextual"/>
             </w:rPr>
           </w:pPr>
-          <w:hyperlink w:anchor="_Toc200610066" w:history="1">
+          <w:hyperlink w:anchor="_Toc200708282" w:history="1">
             <w:r>
               <w:rPr>
                 <w:rStyle w:val="Hipervnculo"/>
@@ -2556,7 +2556,7 @@
                 <w:noProof/>
                 <w:webHidden/>
               </w:rPr>
-              <w:instrText xml:space="preserve"> PAGEREF _Toc200610066 \h </w:instrText>
+              <w:instrText xml:space="preserve"> PAGEREF _Toc200708282 \h </w:instrText>
             </w:r>
             <w:r>
               <w:rPr>
@@ -2576,7 +2576,7 @@
                 <w:noProof/>
                 <w:webHidden/>
               </w:rPr>
-              <w:t>44</w:t>
+              <w:t>47</w:t>
             </w:r>
             <w:r>
               <w:rPr>
@@ -2603,7 +2603,7 @@
               <w14:ligatures w14:val="standardContextual"/>
             </w:rPr>
           </w:pPr>
-          <w:hyperlink w:anchor="_Toc200610067" w:history="1">
+          <w:hyperlink w:anchor="_Toc200708283" w:history="1">
             <w:r>
               <w:rPr>
                 <w:rStyle w:val="Hipervnculo"/>
@@ -2648,7 +2648,7 @@
                 <w:noProof/>
                 <w:webHidden/>
               </w:rPr>
-              <w:instrText xml:space="preserve"> PAGEREF _Toc200610067 \h </w:instrText>
+              <w:instrText xml:space="preserve"> PAGEREF _Toc200708283 \h </w:instrText>
             </w:r>
             <w:r>
               <w:rPr>
@@ -2668,7 +2668,7 @@
                 <w:noProof/>
                 <w:webHidden/>
               </w:rPr>
-              <w:t>46</w:t>
+              <w:t>48</w:t>
             </w:r>
             <w:r>
               <w:rPr>
@@ -2695,7 +2695,7 @@
               <w14:ligatures w14:val="standardContextual"/>
             </w:rPr>
           </w:pPr>
-          <w:hyperlink w:anchor="_Toc200610068" w:history="1">
+          <w:hyperlink w:anchor="_Toc200708284" w:history="1">
             <w:r>
               <w:rPr>
                 <w:rStyle w:val="Hipervnculo"/>
@@ -2740,7 +2740,7 @@
                 <w:noProof/>
                 <w:webHidden/>
               </w:rPr>
-              <w:instrText xml:space="preserve"> PAGEREF _Toc200610068 \h </w:instrText>
+              <w:instrText xml:space="preserve"> PAGEREF _Toc200708284 \h </w:instrText>
             </w:r>
             <w:r>
               <w:rPr>
@@ -2760,7 +2760,7 @@
                 <w:noProof/>
                 <w:webHidden/>
               </w:rPr>
-              <w:t>47</w:t>
+              <w:t>50</w:t>
             </w:r>
             <w:r>
               <w:rPr>
@@ -2787,7 +2787,7 @@
               <w14:ligatures w14:val="standardContextual"/>
             </w:rPr>
           </w:pPr>
-          <w:hyperlink w:anchor="_Toc200610069" w:history="1">
+          <w:hyperlink w:anchor="_Toc200708285" w:history="1">
             <w:r>
               <w:rPr>
                 <w:rStyle w:val="Hipervnculo"/>
@@ -2832,7 +2832,7 @@
                 <w:noProof/>
                 <w:webHidden/>
               </w:rPr>
-              <w:instrText xml:space="preserve"> PAGEREF _Toc200610069 \h </w:instrText>
+              <w:instrText xml:space="preserve"> PAGEREF _Toc200708285 \h </w:instrText>
             </w:r>
             <w:r>
               <w:rPr>
@@ -2852,7 +2852,7 @@
                 <w:noProof/>
                 <w:webHidden/>
               </w:rPr>
-              <w:t>52</w:t>
+              <w:t>56</w:t>
             </w:r>
             <w:r>
               <w:rPr>
@@ -2878,7 +2878,7 @@
               <w14:ligatures w14:val="standardContextual"/>
             </w:rPr>
           </w:pPr>
-          <w:hyperlink w:anchor="_Toc200610070" w:history="1">
+          <w:hyperlink w:anchor="_Toc200708286" w:history="1">
             <w:r>
               <w:rPr>
                 <w:rStyle w:val="Hipervnculo"/>
@@ -2906,7 +2906,7 @@
                 <w:noProof/>
                 <w:webHidden/>
               </w:rPr>
-              <w:instrText xml:space="preserve"> PAGEREF _Toc200610070 \h </w:instrText>
+              <w:instrText xml:space="preserve"> PAGEREF _Toc200708286 \h </w:instrText>
             </w:r>
             <w:r>
               <w:rPr>
@@ -2926,7 +2926,7 @@
                 <w:noProof/>
                 <w:webHidden/>
               </w:rPr>
-              <w:t>53</w:t>
+              <w:t>57</w:t>
             </w:r>
             <w:r>
               <w:rPr>
@@ -2952,7 +2952,7 @@
               <w14:ligatures w14:val="standardContextual"/>
             </w:rPr>
           </w:pPr>
-          <w:hyperlink w:anchor="_Toc200610071" w:history="1">
+          <w:hyperlink w:anchor="_Toc200708287" w:history="1">
             <w:r>
               <w:rPr>
                 <w:rStyle w:val="Hipervnculo"/>
@@ -2979,7 +2979,7 @@
                 <w:noProof/>
                 <w:webHidden/>
               </w:rPr>
-              <w:instrText xml:space="preserve"> PAGEREF _Toc200610071 \h </w:instrText>
+              <w:instrText xml:space="preserve"> PAGEREF _Toc200708287 \h </w:instrText>
             </w:r>
             <w:r>
               <w:rPr>
@@ -2999,7 +2999,7 @@
                 <w:noProof/>
                 <w:webHidden/>
               </w:rPr>
-              <w:t>54</w:t>
+              <w:t>58</w:t>
             </w:r>
             <w:r>
               <w:rPr>
@@ -3042,7 +3042,7 @@
           <w:numId w:val="0"/>
         </w:numPr>
       </w:pPr>
-      <w:bookmarkStart w:id="4" w:name="_Toc200610047"/>
+      <w:bookmarkStart w:id="4" w:name="_Toc200708263"/>
       <w:r>
         <w:lastRenderedPageBreak/>
         <w:t>Índice de figuras</w:t>
@@ -3068,7 +3068,7 @@
       <w:pPr>
         <w:pStyle w:val="Ttulo1"/>
       </w:pPr>
-      <w:bookmarkStart w:id="5" w:name="_Toc200610048"/>
+      <w:bookmarkStart w:id="5" w:name="_Toc200708264"/>
       <w:r>
         <w:lastRenderedPageBreak/>
         <w:t>Introducción</w:t>
@@ -3183,7 +3183,7 @@
       <w:pPr>
         <w:pStyle w:val="Ttulo1"/>
       </w:pPr>
-      <w:bookmarkStart w:id="6" w:name="_Toc200610049"/>
+      <w:bookmarkStart w:id="6" w:name="_Toc200708265"/>
       <w:r>
         <w:lastRenderedPageBreak/>
         <w:t>Estado del arte</w:t>
@@ -3511,7 +3511,7 @@
       <w:pPr>
         <w:pStyle w:val="Ttulo1"/>
       </w:pPr>
-      <w:bookmarkStart w:id="7" w:name="_Toc200610050"/>
+      <w:bookmarkStart w:id="7" w:name="_Toc200708266"/>
       <w:r>
         <w:lastRenderedPageBreak/>
         <w:t>O</w:t>
@@ -3702,7 +3702,7 @@
       <w:pPr>
         <w:pStyle w:val="Ttulo1"/>
       </w:pPr>
-      <w:bookmarkStart w:id="8" w:name="_Toc200610051"/>
+      <w:bookmarkStart w:id="8" w:name="_Toc200708267"/>
       <w:r>
         <w:lastRenderedPageBreak/>
         <w:t>Descripción informática</w:t>
@@ -3736,7 +3736,7 @@
       <w:pPr>
         <w:pStyle w:val="Ttulo2"/>
       </w:pPr>
-      <w:bookmarkStart w:id="9" w:name="_Toc200610052"/>
+      <w:bookmarkStart w:id="9" w:name="_Toc200708268"/>
       <w:r>
         <w:t xml:space="preserve">Análisis </w:t>
       </w:r>
@@ -3851,7 +3851,7 @@
       <w:pPr>
         <w:pStyle w:val="Ttulo3"/>
       </w:pPr>
-      <w:bookmarkStart w:id="10" w:name="_Toc200610053"/>
+      <w:bookmarkStart w:id="10" w:name="_Toc200708269"/>
       <w:r>
         <w:t>Funcionalidades del sistema</w:t>
       </w:r>
@@ -4359,7 +4359,7 @@
           <w:numId w:val="49"/>
         </w:numPr>
       </w:pPr>
-      <w:bookmarkStart w:id="11" w:name="_Toc200610054"/>
+      <w:bookmarkStart w:id="11" w:name="_Toc200708270"/>
       <w:r>
         <w:t>Modelo del dominio</w:t>
       </w:r>
@@ -4979,7 +4979,7 @@
         </w:rPr>
         <w:lastRenderedPageBreak/>
         <w:drawing>
-          <wp:inline distT="0" distB="0" distL="0" distR="0" wp14:anchorId="39DB886C" wp14:editId="282BE614">
+          <wp:inline distT="0" distB="0" distL="0" distR="0" wp14:anchorId="39DB886C" wp14:editId="518F4982">
             <wp:extent cx="5759450" cy="1797685"/>
             <wp:effectExtent l="0" t="0" r="0" b="0"/>
             <wp:docPr id="583523944" name="Imagen 19" descr="Diagrama, Esquemático&#10;&#10;El contenido generado por IA puede ser incorrecto."/>
@@ -5166,7 +5166,7 @@
         </w:rPr>
         <w:lastRenderedPageBreak/>
         <w:drawing>
-          <wp:inline distT="0" distB="0" distL="0" distR="0" wp14:anchorId="3C787A6B" wp14:editId="09694FED">
+          <wp:inline distT="0" distB="0" distL="0" distR="0" wp14:anchorId="3C787A6B" wp14:editId="0E258C98">
             <wp:extent cx="5759450" cy="2258060"/>
             <wp:effectExtent l="0" t="0" r="0" b="8890"/>
             <wp:docPr id="2092313305" name="Imagen 20" descr="Diagrama&#10;&#10;El contenido generado por IA puede ser incorrecto."/>
@@ -5221,7 +5221,7 @@
           <w:numId w:val="49"/>
         </w:numPr>
       </w:pPr>
-      <w:bookmarkStart w:id="12" w:name="_Toc200610055"/>
+      <w:bookmarkStart w:id="12" w:name="_Toc200708271"/>
       <w:r>
         <w:t>Análisis funcional</w:t>
       </w:r>
@@ -5351,7 +5351,7 @@
         </w:rPr>
         <w:lastRenderedPageBreak/>
         <w:drawing>
-          <wp:inline distT="0" distB="0" distL="0" distR="0" wp14:anchorId="1AC0D4E9" wp14:editId="7C955EF8">
+          <wp:inline distT="0" distB="0" distL="0" distR="0" wp14:anchorId="1AC0D4E9" wp14:editId="1FB8C335">
             <wp:extent cx="5759450" cy="4045585"/>
             <wp:effectExtent l="0" t="0" r="0" b="0"/>
             <wp:docPr id="799915615" name="Imagen 4" descr="Diagrama&#10;&#10;El contenido generado por IA puede ser incorrecto."/>
@@ -5733,7 +5733,7 @@
           <w:noProof/>
         </w:rPr>
         <w:drawing>
-          <wp:inline distT="0" distB="0" distL="0" distR="0" wp14:anchorId="1D9C21A9" wp14:editId="0481A4A1">
+          <wp:inline distT="0" distB="0" distL="0" distR="0" wp14:anchorId="1D9C21A9" wp14:editId="0370F6CD">
             <wp:extent cx="5759450" cy="2900045"/>
             <wp:effectExtent l="0" t="0" r="0" b="0"/>
             <wp:docPr id="1306814774" name="Imagen 13" descr="Diagrama&#10;&#10;El contenido generado por IA puede ser incorrecto."/>
@@ -5792,7 +5792,7 @@
         </w:rPr>
         <w:lastRenderedPageBreak/>
         <w:drawing>
-          <wp:inline distT="0" distB="0" distL="0" distR="0" wp14:anchorId="4B10C7DB" wp14:editId="22B13D19">
+          <wp:inline distT="0" distB="0" distL="0" distR="0" wp14:anchorId="4B10C7DB" wp14:editId="53411935">
             <wp:extent cx="5759450" cy="4269740"/>
             <wp:effectExtent l="0" t="0" r="0" b="0"/>
             <wp:docPr id="590343854" name="Imagen 14" descr="Diagrama&#10;&#10;El contenido generado por IA puede ser incorrecto."/>
@@ -5917,7 +5917,7 @@
           <w:numId w:val="49"/>
         </w:numPr>
       </w:pPr>
-      <w:bookmarkStart w:id="13" w:name="_Toc200610056"/>
+      <w:bookmarkStart w:id="13" w:name="_Toc200708272"/>
       <w:r>
         <w:t>Arquitectura</w:t>
       </w:r>
@@ -6265,7 +6265,7 @@
       <w:pPr>
         <w:pStyle w:val="Ttulo2"/>
       </w:pPr>
-      <w:bookmarkStart w:id="14" w:name="_Toc200610057"/>
+      <w:bookmarkStart w:id="14" w:name="_Toc200708273"/>
       <w:r>
         <w:t>Implementación de endpoints del dominio propio</w:t>
       </w:r>
@@ -6281,47 +6281,212 @@
     </w:p>
     <w:p>
       <w:r>
-        <w:t>Dicho lo cual, a continuación, se detallan los pasos seguidos para definir, implementar y exponer varios endpoints relacionados con la gestión de las reseñas que se realizan en el sistema, de manera que, a partir de estos ejemplos, se pueda entender fácilmente el proceso seguido para todos los endpoints del dominio propio de la aplicación.</w:t>
-      </w:r>
-    </w:p>
-    <w:p/>
-    <w:p>
-      <w:pPr>
-        <w:pStyle w:val="Ttulo3"/>
-      </w:pPr>
-      <w:bookmarkStart w:id="15" w:name="_Toc200610058"/>
-      <w:r>
-        <w:lastRenderedPageBreak/>
-        <w:t>Definición de un endpoint</w:t>
-      </w:r>
-      <w:bookmarkEnd w:id="15"/>
-    </w:p>
-    <w:p>
-      <w:r>
-        <w:t>Para este proyecto, la definición de endpoints se ha realizado mediante el uso de la librería Tapir, que</w:t>
-      </w:r>
-      <w:r>
-        <w:t xml:space="preserve"> permite llevar a cabo dicha tarea de manera sencilla, legible, funcional y escalable, pues posibilita definir endpoints sobre otros endpoints “base”, aprovechando las características de estos últimos sin necesidad de duplicar código constantemente.</w:t>
-      </w:r>
-    </w:p>
-    <w:p>
-      <w:pPr>
+        <w:t>Para e</w:t>
+      </w:r>
+      <w:r>
+        <w:t>llo</w:t>
+      </w:r>
+      <w:r>
+        <w:t>, se ha optado por utilizar la librería Tapir, una librería funcional para definir y consumir endpoints de APIs HTTP en Scala. Esta decisión se ha tomado tras analizar varias alternativas disponibles en el ecosistema Scala, como Akka</w:t>
+      </w:r>
+      <w:r>
         <w:rPr>
           <w:b/>
           <w:bCs/>
         </w:rPr>
-      </w:pPr>
+        <w:t xml:space="preserve"> </w:t>
+      </w:r>
+      <w:r>
+        <w:t>HTTP, http4s o Play</w:t>
+      </w:r>
       <w:r>
         <w:rPr>
           <w:b/>
           <w:bCs/>
         </w:rPr>
-        <w:t>[JUSTIFICAR ELECCIÓN DE TAPIR PARA LA DEFINICIÓN DE ENDPOINTS].</w:t>
-      </w:r>
-    </w:p>
-    <w:p>
-      <w:r>
-        <w:t>Entre las cosas que podemos definir en un endpoint, se encuentran el nombre, la describción, el método HTTP, la ruta por la que se accede al endpoint, los parámetros de entrada (ya sean de ruta, de consulta o el cuerpo de la petición) y los valores devueltos (códigos de estatus, mensajes de éxito o error, u objetos JSON) al realizar la llamada.</w:t>
+        <w:t xml:space="preserve"> </w:t>
+      </w:r>
+      <w:r>
+        <w:t>Framework, y considerar los requisitos del proyecto, así como las ventajas que Tapir ofrece en comparación.</w:t>
+      </w:r>
+    </w:p>
+    <w:p>
+      <w:r>
+        <w:lastRenderedPageBreak/>
+        <w:t>Tapir permite definir los endpoints de manera declarativa</w:t>
+      </w:r>
+      <w:r>
+        <w:rPr>
+          <w:b/>
+          <w:bCs/>
+        </w:rPr>
+        <w:t xml:space="preserve"> y </w:t>
+      </w:r>
+      <w:r>
+        <w:t>fuertemente</w:t>
+      </w:r>
+      <w:r>
+        <w:rPr>
+          <w:b/>
+          <w:bCs/>
+        </w:rPr>
+        <w:t xml:space="preserve"> </w:t>
+      </w:r>
+      <w:r>
+        <w:t>tipada, describiendo no solo la lógica de negocio, sino también el contrato de cada operación HTTP de forma centralizada y reutilizable. Esta aproximación resulta especialmente ventajosa en entornos donde la seguridad</w:t>
+      </w:r>
+      <w:r>
+        <w:rPr>
+          <w:b/>
+          <w:bCs/>
+        </w:rPr>
+        <w:t xml:space="preserve"> </w:t>
+      </w:r>
+      <w:r>
+        <w:t>de</w:t>
+      </w:r>
+      <w:r>
+        <w:rPr>
+          <w:b/>
+          <w:bCs/>
+        </w:rPr>
+        <w:t xml:space="preserve"> </w:t>
+      </w:r>
+      <w:r>
+        <w:t>tipos y la coherencia</w:t>
+      </w:r>
+      <w:r>
+        <w:rPr>
+          <w:b/>
+          <w:bCs/>
+        </w:rPr>
+        <w:t xml:space="preserve"> </w:t>
+      </w:r>
+      <w:r>
+        <w:t>entre</w:t>
+      </w:r>
+      <w:r>
+        <w:rPr>
+          <w:b/>
+          <w:bCs/>
+        </w:rPr>
+        <w:t xml:space="preserve"> </w:t>
+      </w:r>
+      <w:r>
+        <w:t>cliente</w:t>
+      </w:r>
+      <w:r>
+        <w:t xml:space="preserve"> y</w:t>
+      </w:r>
+      <w:r>
+        <w:t xml:space="preserve"> servidor son prioritarias, como es el caso de este trabajo.</w:t>
+      </w:r>
+    </w:p>
+    <w:p>
+      <w:r>
+        <w:t>Una de las principales razones para elegir Tapir es su integración directa con otras herramientas funcionales del ecosistema Scala, como Cats Effect o http4s, lo que facilita la composición modular y funcional de la lógica de negocio. Además, Tapir permite generar automáticamente clientes HTTP, evitando duplicidades y garantizando la consistencia entre implementación y documentación.</w:t>
+      </w:r>
+    </w:p>
+    <w:p>
+      <w:r>
+        <w:t>Comparado con otras alternativas:</w:t>
+      </w:r>
+    </w:p>
+    <w:p>
+      <w:pPr>
+        <w:numPr>
+          <w:ilvl w:val="0"/>
+          <w:numId w:val="67"/>
+        </w:numPr>
+      </w:pPr>
+      <w:r>
+        <w:t>Akka HTTP es potente y ampliamente usado, pero presenta una curva de aprendizaje más pronunciada y una menor orientación a la separación entre la definición de los endpoints y su lógica de implementación.</w:t>
+      </w:r>
+    </w:p>
+    <w:p>
+      <w:pPr>
+        <w:numPr>
+          <w:ilvl w:val="0"/>
+          <w:numId w:val="67"/>
+        </w:numPr>
+      </w:pPr>
+      <w:r>
+        <w:t>http4s sigue un enfoque puramente funcional y es muy adecuado para sistemas basados en efectos, pero carece de una capa declarativa para definir endpoints y de una integración transparente con herramientas de documentación como OpenAPI.</w:t>
+      </w:r>
+    </w:p>
+    <w:p>
+      <w:pPr>
+        <w:numPr>
+          <w:ilvl w:val="0"/>
+          <w:numId w:val="67"/>
+        </w:numPr>
+      </w:pPr>
+      <w:r>
+        <w:t>Play</w:t>
+      </w:r>
+      <w:r>
+        <w:rPr>
+          <w:b/>
+          <w:bCs/>
+        </w:rPr>
+        <w:t xml:space="preserve"> </w:t>
+      </w:r>
+      <w:r>
+        <w:t>Framework es una opción sólida para aplicaciones web completas que incluyen interfaz de usuario, lógica de negocio y persistencia en un único proyecto, pero puede resultar más pesado o sobredimensionado cuando el objetivo es desarrollar únicamente el backend o una capa de exposición ligera, como en este caso. En cambio, Tapir permite definir los endpoints sin imponer una estructura de aplicación completa.</w:t>
+      </w:r>
+    </w:p>
+    <w:p>
+      <w:pPr>
+        <w:rPr>
+          <w:b/>
+          <w:bCs/>
+        </w:rPr>
+      </w:pPr>
+      <w:r>
+        <w:t>En resumen, Tapir ha sido seleccionada por su capacidad para describir</w:t>
+      </w:r>
+      <w:r>
+        <w:rPr>
+          <w:b/>
+          <w:bCs/>
+        </w:rPr>
+        <w:t xml:space="preserve"> </w:t>
+      </w:r>
+      <w:r>
+        <w:t>endpoints de forma expresiva, reutilizable y segura, facilitando al mismo tiempo</w:t>
+      </w:r>
+      <w:r>
+        <w:t xml:space="preserve"> </w:t>
+      </w:r>
+      <w:r>
+        <w:t>la integración con otras herramientas funcionales. Esto ha permitido mantener una base de código clara, mantenible y coherente con los principios de diseño funcional adoptados a lo largo del proyecto.</w:t>
+      </w:r>
+    </w:p>
+    <w:p>
+      <w:r>
+        <w:t>Dicho lo cual, a continuación, se detallan los pasos seguidos para definir, implementar y exponer varios endpoints relacionados con la gestión de las reseñas que se realizan en el sistema, de manera que, a partir de estos ejemplos, se pueda entender fácilmente el proceso seguido para todos los endpoints del dominio propio de la aplicación.</w:t>
+      </w:r>
+    </w:p>
+    <w:p/>
+    <w:p>
+      <w:pPr>
+        <w:pStyle w:val="Ttulo3"/>
+      </w:pPr>
+      <w:bookmarkStart w:id="15" w:name="_Toc200708274"/>
+      <w:r>
+        <w:t>Definición de un endpoint</w:t>
+      </w:r>
+      <w:bookmarkEnd w:id="15"/>
+    </w:p>
+    <w:p>
+      <w:r>
+        <w:t xml:space="preserve">Entre las cosas que podemos definir en un endpoint, se encuentran el nombre, la </w:t>
+      </w:r>
+      <w:r>
+        <w:t>descripción</w:t>
+      </w:r>
+      <w:r>
+        <w:t>, el método HTTP, la ruta por la que se accede al endpoint, los parámetros de entrada (ya sean de ruta, de consulta o el cuerpo de la petición) y los valores devueltos (códigos de estatus, mensajes de éxito o error, u objetos JSON) al realizar la llamada.</w:t>
       </w:r>
     </w:p>
     <w:p>
@@ -6332,7 +6497,7 @@
           <w:numId w:val="63"/>
         </w:numPr>
       </w:pPr>
-      <w:bookmarkStart w:id="16" w:name="_Toc200610059"/>
+      <w:bookmarkStart w:id="16" w:name="_Toc200708275"/>
       <w:r>
         <w:t>Conceptos básicos de un endpoint</w:t>
       </w:r>
@@ -6656,7 +6821,6 @@
     </w:p>
     <w:p>
       <w:r>
-        <w:lastRenderedPageBreak/>
         <w:t xml:space="preserve">Por tanto, en los endpoints que definamos vamos a sustituir los tipos </w:t>
       </w:r>
       <w:r>
@@ -6784,6 +6948,7 @@
         <w:rPr>
           <w:noProof/>
         </w:rPr>
+        <w:lastRenderedPageBreak/>
         <w:drawing>
           <wp:inline distT="0" distB="0" distL="0" distR="0" wp14:anchorId="4BE522A6" wp14:editId="45899BAE">
             <wp:extent cx="5759450" cy="1332230"/>
@@ -7034,9 +7199,8 @@
           <w:numId w:val="63"/>
         </w:numPr>
       </w:pPr>
-      <w:bookmarkStart w:id="17" w:name="_Toc200610060"/>
-      <w:r>
-        <w:lastRenderedPageBreak/>
+      <w:bookmarkStart w:id="17" w:name="_Toc200708276"/>
+      <w:r>
         <w:t>Endpoints base</w:t>
       </w:r>
       <w:bookmarkEnd w:id="17"/>
@@ -7090,6 +7254,7 @@
         <w:rPr>
           <w:noProof/>
         </w:rPr>
+        <w:lastRenderedPageBreak/>
         <w:drawing>
           <wp:inline distT="0" distB="0" distL="0" distR="0" wp14:anchorId="570137F8" wp14:editId="55B7B8FA">
             <wp:extent cx="5759450" cy="577215"/>
@@ -7283,7 +7448,6 @@
         <w:rPr>
           <w:noProof/>
         </w:rPr>
-        <w:lastRenderedPageBreak/>
         <w:drawing>
           <wp:inline distT="0" distB="0" distL="0" distR="0" wp14:anchorId="496CE919" wp14:editId="5F623742">
             <wp:extent cx="5759450" cy="1880870"/>
@@ -7364,7 +7528,11 @@
         <w:t>Unknown</w:t>
       </w:r>
       <w:r>
-        <w:t xml:space="preserve">, todos con la clase de error que les corresponde y que contiene el mensaje que se mostrará al usuario. Si se completa la ejecución del endpoint correctamente, se devuelve un código de estatus </w:t>
+        <w:t xml:space="preserve">, todos con la clase de error que les corresponde y que contiene el mensaje que se mostrará al </w:t>
+      </w:r>
+      <w:r>
+        <w:lastRenderedPageBreak/>
+        <w:t xml:space="preserve">usuario. Si se completa la ejecución del endpoint correctamente, se devuelve un código de estatus </w:t>
       </w:r>
       <w:r>
         <w:rPr>
@@ -7503,7 +7671,7 @@
           <w:numId w:val="63"/>
         </w:numPr>
       </w:pPr>
-      <w:bookmarkStart w:id="18" w:name="_Toc200610061"/>
+      <w:bookmarkStart w:id="18" w:name="_Toc200708277"/>
       <w:r>
         <w:t>Parámetros de E/S y códecs</w:t>
       </w:r>
@@ -7557,7 +7725,6 @@
           <w:i/>
           <w:iCs/>
         </w:rPr>
-        <w:lastRenderedPageBreak/>
         <w:t>query</w:t>
       </w:r>
       <w:r>
@@ -7668,6 +7835,7 @@
         <w:rPr>
           <w:noProof/>
         </w:rPr>
+        <w:lastRenderedPageBreak/>
         <w:drawing>
           <wp:inline distT="0" distB="0" distL="0" distR="0" wp14:anchorId="1FFC41DE" wp14:editId="24BED662">
             <wp:extent cx="5759450" cy="425450"/>
@@ -7931,7 +8099,6 @@
     </w:p>
     <w:p>
       <w:r>
-        <w:lastRenderedPageBreak/>
         <w:t xml:space="preserve">En cuanto al parámetro de salida del endpoint, se define como valor del tipo </w:t>
       </w:r>
       <w:r>
@@ -8177,7 +8344,7 @@
           <w:numId w:val="63"/>
         </w:numPr>
       </w:pPr>
-      <w:bookmarkStart w:id="19" w:name="_Toc200610062"/>
+      <w:bookmarkStart w:id="19" w:name="_Toc200708278"/>
       <w:r>
         <w:lastRenderedPageBreak/>
         <w:t>Implementación de la lógica de un endpoint</w:t>
@@ -8304,15 +8471,146 @@
       <w:r>
         <w:t xml:space="preserve">. </w:t>
       </w:r>
-      <w:r>
-        <w:rPr>
-          <w:b/>
-          <w:bCs/>
-        </w:rPr>
-        <w:t>[EXPLICAR TIPO IO]</w:t>
+    </w:p>
+    <w:p>
+      <w:r>
+        <w:t xml:space="preserve">El </w:t>
+      </w:r>
+      <w:r>
+        <w:t xml:space="preserve">recién mencionado </w:t>
+      </w:r>
+      <w:r>
+        <w:t xml:space="preserve">tipo </w:t>
+      </w:r>
+      <w:r>
+        <w:rPr>
+          <w:i/>
+          <w:iCs/>
+        </w:rPr>
+        <w:t>IO</w:t>
+      </w:r>
+      <w:r>
+        <w:t xml:space="preserve">, que aparece en esta y en otras lógicas del proyecto, es una herramienta clave cuando se trabaja con efectos en aplicaciones funcionales. En concreto, </w:t>
+      </w:r>
+      <w:r>
+        <w:rPr>
+          <w:i/>
+          <w:iCs/>
+        </w:rPr>
+        <w:t>IO[A]</w:t>
+      </w:r>
+      <w:r>
+        <w:t xml:space="preserve"> representa una operación que, cuando se ejecuta, devolverá un valor de tipo </w:t>
+      </w:r>
+      <w:r>
+        <w:rPr>
+          <w:i/>
+          <w:iCs/>
+        </w:rPr>
+        <w:t>A</w:t>
+      </w:r>
+      <w:r>
+        <w:t xml:space="preserve">, y que </w:t>
+      </w:r>
+      <w:r>
+        <w:lastRenderedPageBreak/>
+        <w:t>puede implicar efectos secundarios (por ejemplo, leer datos, escribir en una base de datos, o gestionar errores).</w:t>
+      </w:r>
+    </w:p>
+    <w:p>
+      <w:r>
+        <w:t>Este tipo permite encapsular este tipo de operaciones de forma segura y controlada, lo que significa que las funciones que lo devuelven no ejecutan nada directamente, sino que simplemente describen lo que se quiere hacer. La ejecución real se pospone hasta que el programa lo indica explícitamente (normalmente, en el punto de entrada principal de la aplicación).</w:t>
+      </w:r>
+    </w:p>
+    <w:p>
+      <w:r>
+        <w:t xml:space="preserve">En nuestro caso, por ejemplo, </w:t>
+      </w:r>
+      <w:r>
+        <w:rPr>
+          <w:i/>
+          <w:iCs/>
+        </w:rPr>
+        <w:t>getAllReviews</w:t>
+      </w:r>
+      <w:r>
+        <w:t xml:space="preserve"> devuelve un </w:t>
+      </w:r>
+      <w:r>
+        <w:rPr>
+          <w:i/>
+          <w:iCs/>
+        </w:rPr>
+        <w:t>IO[Either[UserError, List[Review]]]</w:t>
+      </w:r>
+      <w:r>
+        <w:t xml:space="preserve">. Esto significa que, al ejecutarlo, obtendremos o bien un error (por ejemplo, si el parámetro de ordenación es incorrecto), o bien una lista de </w:t>
+      </w:r>
+      <w:r>
+        <w:t>reseñas</w:t>
+      </w:r>
+      <w:r>
+        <w:t xml:space="preserve"> válida, ya filtrada y ordenada. Pero mientras no se ejecute ese </w:t>
+      </w:r>
+      <w:r>
+        <w:rPr>
+          <w:i/>
+          <w:iCs/>
+        </w:rPr>
+        <w:t>IO</w:t>
+      </w:r>
+      <w:r>
+        <w:t>, no se ha hecho ningún trabajo todavía.</w:t>
+      </w:r>
+    </w:p>
+    <w:p>
+      <w:r>
+        <w:t xml:space="preserve">Una de las principales ventajas de usar este tipo es que nos permite componer operaciones de forma sencilla (gracias a que </w:t>
+      </w:r>
+      <w:r>
+        <w:rPr>
+          <w:i/>
+          <w:iCs/>
+        </w:rPr>
+        <w:t>IO</w:t>
+      </w:r>
+      <w:r>
+        <w:t xml:space="preserve"> es una mónada), y además gestionar los errores de forma limpia, como se hace aquí con el </w:t>
+      </w:r>
+      <w:r>
+        <w:rPr>
+          <w:i/>
+          <w:iCs/>
+        </w:rPr>
+        <w:t>handleError</w:t>
+      </w:r>
+      <w:r>
+        <w:t xml:space="preserve">. También es útil a la hora de mantener el código más limpio, testable y predecible, ya que no hay efectos inesperados fuera del </w:t>
+      </w:r>
+      <w:r>
+        <w:rPr>
+          <w:i/>
+          <w:iCs/>
+        </w:rPr>
+        <w:t>IO</w:t>
       </w:r>
       <w:r>
         <w:t>.</w:t>
+      </w:r>
+    </w:p>
+    <w:p>
+      <w:r>
+        <w:t xml:space="preserve">En resumen, </w:t>
+      </w:r>
+      <w:r>
+        <w:rPr>
+          <w:i/>
+          <w:iCs/>
+        </w:rPr>
+        <w:t>IO</w:t>
+      </w:r>
+      <w:r>
+        <w:t xml:space="preserve"> nos sirve para trabajar con operaciones que pueden fallar o tener efectos, sin perder las ventajas de la programación funcional, como la claridad, la modularidad o la facilidad para razonar sobre el comportamiento del programa.</w:t>
       </w:r>
     </w:p>
     <w:p>
@@ -8323,7 +8621,7 @@
           <w:numId w:val="63"/>
         </w:numPr>
       </w:pPr>
-      <w:bookmarkStart w:id="20" w:name="_Toc200610063"/>
+      <w:bookmarkStart w:id="20" w:name="_Toc200708279"/>
       <w:r>
         <w:t>Exposición de un endpoint</w:t>
       </w:r>
@@ -8344,15 +8642,7 @@
           <w:b/>
           <w:bCs/>
         </w:rPr>
-        <w:t xml:space="preserve">[SUSTITUIR POR NOMBRE </w:t>
-      </w:r>
-      <w:r>
-        <w:rPr>
-          <w:b/>
-          <w:bCs/>
-        </w:rPr>
-        <w:lastRenderedPageBreak/>
-        <w:t>DE LA FIGURA]</w:t>
+        <w:t>[SUSTITUIR POR NOMBRE DE LA FIGURA]</w:t>
       </w:r>
       <w:r>
         <w:t>, lo llamamos “ruta”</w:t>
@@ -8416,37 +8706,6 @@
       </w:r>
     </w:p>
     <w:p>
-      <w:r>
-        <w:t xml:space="preserve">En este caso, estaríamos </w:t>
-      </w:r>
-      <w:r>
-        <w:t>diciéndole a la aplicación</w:t>
-      </w:r>
-      <w:r>
-        <w:t xml:space="preserve"> que, cuando se reciba una llamada al endpoint </w:t>
-      </w:r>
-      <w:r>
-        <w:rPr>
-          <w:i/>
-          <w:iCs/>
-        </w:rPr>
-        <w:t>getAllReviews</w:t>
-      </w:r>
-      <w:r>
-        <w:t xml:space="preserve">, se debe ejecutar la función </w:t>
-      </w:r>
-      <w:r>
-        <w:rPr>
-          <w:i/>
-          <w:iCs/>
-        </w:rPr>
-        <w:t>getAllReviews</w:t>
-      </w:r>
-      <w:r>
-        <w:t xml:space="preserve">. </w:t>
-      </w:r>
-    </w:p>
-    <w:p>
       <w:pPr>
         <w:rPr>
           <w:b/>
@@ -8454,19 +8713,177 @@
         </w:rPr>
       </w:pPr>
       <w:r>
+        <w:t xml:space="preserve">En este caso, estaríamos </w:t>
+      </w:r>
+      <w:r>
+        <w:t>diciéndole a la aplicación</w:t>
+      </w:r>
+      <w:r>
+        <w:t xml:space="preserve"> que, cuando se reciba una llamada al endpoint </w:t>
+      </w:r>
+      <w:r>
+        <w:rPr>
+          <w:i/>
+          <w:iCs/>
+        </w:rPr>
+        <w:t>getAllReviews</w:t>
+      </w:r>
+      <w:r>
+        <w:t xml:space="preserve">, se debe ejecutar la función </w:t>
+      </w:r>
+      <w:r>
+        <w:rPr>
+          <w:i/>
+          <w:iCs/>
+        </w:rPr>
+        <w:t>getAllReviews</w:t>
+      </w:r>
+      <w:r>
+        <w:t>.</w:t>
+      </w:r>
+    </w:p>
+    <w:p>
+      <w:r>
+        <w:lastRenderedPageBreak/>
+        <w:t xml:space="preserve">Para hacer esta asociación se utiliza la clase </w:t>
+      </w:r>
+      <w:r>
+        <w:rPr>
+          <w:i/>
+          <w:iCs/>
+        </w:rPr>
+        <w:t>Http4sServerInterpreter</w:t>
+      </w:r>
+      <w:r>
+        <w:t xml:space="preserve">, que forma parte de la librería Tapir. Esta clase permite transformar un endpoint definido con Tapir, junto con su lógica de ejecución (especificada mediante </w:t>
+      </w:r>
+      <w:r>
+        <w:rPr>
+          <w:i/>
+          <w:iCs/>
+        </w:rPr>
+        <w:t>.serverLogic(...)</w:t>
+      </w:r>
+      <w:r>
+        <w:t>), en una ruta que http4s puede entender y gestionar. Es decir, convierte una descripción abstracta de un endpoint más su lógica funcional, en una ruta ejecutable dentro de un servidor real.</w:t>
+      </w:r>
+    </w:p>
+    <w:p>
+      <w:r>
+        <w:t>Este proceso se apoya en la librería http4s, una herramienta diseñada para construir aplicaciones web y servicios HTTP en Scala siguiendo un enfoque puramente funcional. Uno de los motivos por los que se ha elegido esta librería para el proyecto es precisamente ese: su diseño está basado en los principios de la programación funcional pura, utilizando estructuras inmutables y controlando los efectos mediante abstracciones como</w:t>
+      </w:r>
+      <w:r>
+        <w:rPr>
+          <w:i/>
+          <w:iCs/>
+        </w:rPr>
+        <w:t xml:space="preserve"> IO </w:t>
+      </w:r>
+      <w:r>
+        <w:t>de Cats Effect</w:t>
+      </w:r>
+      <w:r>
+        <w:t>. Además, es completamente modular, interoperable con otras librerías funcionales del ecosistema Scala (como circe para JSON o la propia Tapir), y utiliza fs2 como motor de streaming para manejar datos de forma eficiente.</w:t>
+      </w:r>
+    </w:p>
+    <w:p>
+      <w:r>
+        <w:t>Gracias a estas propiedades, http4s se adapta especialmente bien a proyectos en los que se quiere tener un control explícito sobre los efectos, mantener una arquitectura limpia, y asegurar la trazabilidad y el razonamiento sobre el flujo de datos en la aplicación. Esto lo convierte en una opción especialmente adecuada para este trabajo, donde se busca un diseño seguro, claro y mantenible.</w:t>
+      </w:r>
+    </w:p>
+    <w:p>
+      <w:r>
+        <w:t xml:space="preserve">Una vez que se transforma un endpoint mediante </w:t>
+      </w:r>
+      <w:r>
+        <w:rPr>
+          <w:i/>
+          <w:iCs/>
+        </w:rPr>
+        <w:t>Http4sServerInterpreter</w:t>
+      </w:r>
+      <w:r>
+        <w:t xml:space="preserve">, lo que se obtiene es una instancia de tipo </w:t>
+      </w:r>
+      <w:r>
+        <w:rPr>
+          <w:i/>
+          <w:iCs/>
+        </w:rPr>
+        <w:t>HttpRoutes[IO]</w:t>
+      </w:r>
+      <w:r>
+        <w:t>.</w:t>
+      </w:r>
+    </w:p>
+    <w:p>
+      <w:r>
+        <w:t xml:space="preserve">Este tipo representa una colección de rutas HTTP que pueden gestionar peticiones dentro del contexto funcional proporcionado por </w:t>
+      </w:r>
+      <w:r>
+        <w:rPr>
+          <w:i/>
+          <w:iCs/>
+        </w:rPr>
+        <w:t>IO</w:t>
+      </w:r>
+      <w:r>
+        <w:t xml:space="preserve">. Es decir, cada ruta es una función parcial que, dado un </w:t>
+      </w:r>
+      <w:r>
+        <w:rPr>
+          <w:i/>
+          <w:iCs/>
+        </w:rPr>
+        <w:t>Request[IO]</w:t>
+      </w:r>
+      <w:r>
+        <w:t xml:space="preserve">, puede devolver un </w:t>
+      </w:r>
+      <w:r>
+        <w:rPr>
+          <w:i/>
+          <w:iCs/>
+        </w:rPr>
+        <w:t>Response[IO]</w:t>
+      </w:r>
+      <w:r>
+        <w:t>, si la petición coincide con alguna ruta definida. Esta forma de trabajar permite definir el comportamiento del servidor de forma declarativa, segura y totalmente funcional: no se ejecuta nada directamente, sino que se describe cómo debe responderse en cada caso.</w:t>
+      </w:r>
+    </w:p>
+    <w:p>
+      <w:r>
+        <w:t xml:space="preserve">Además, las distintas rutas pueden componerse entre sí muy fácilmente mediante operadores como </w:t>
+      </w:r>
+      <w:r>
+        <w:rPr>
+          <w:i/>
+          <w:iCs/>
+        </w:rPr>
+        <w:t>&lt;+&gt;</w:t>
+      </w:r>
+      <w:r>
+        <w:t>, lo cual permite agruparlas por funcionalidad. Por ejemplo, en este proyecto se agrupan todas las rutas relacionadas con reseñas en una sola variable (</w:t>
+      </w:r>
+      <w:r>
+        <w:rPr>
+          <w:i/>
+          <w:iCs/>
+        </w:rPr>
+        <w:t>reviewsRoutes</w:t>
+      </w:r>
+      <w:r>
+        <w:t xml:space="preserve">, </w:t>
+      </w:r>
+      <w:r>
         <w:rPr>
           <w:b/>
           <w:bCs/>
         </w:rPr>
-        <w:t>[EXPLICAR HTTP4S, O HTTPS4SSERVERINTERPRETER]</w:t>
-      </w:r>
-    </w:p>
-    <w:p>
-      <w:r>
-        <w:t xml:space="preserve">A continuación, </w:t>
-      </w:r>
-      <w:r>
-        <w:t>se incluye la ruta en una variable que recoge todas las rutas definidas en el mismo objeto.</w:t>
+        <w:t>[SUSTITUIR POR NOMBRE DE LA FIGURA]</w:t>
+      </w:r>
+      <w:r>
+        <w:t>), y luego se hace lo mismo con otras funcionalidades (como usuarios, actividades, etc.).</w:t>
       </w:r>
     </w:p>
     <w:p>
@@ -8474,8 +8891,9 @@
         <w:rPr>
           <w:noProof/>
         </w:rPr>
+        <w:lastRenderedPageBreak/>
         <w:drawing>
-          <wp:inline distT="0" distB="0" distL="0" distR="0" wp14:anchorId="4465FEAC" wp14:editId="1362899B">
+          <wp:inline distT="0" distB="0" distL="0" distR="0" wp14:anchorId="7548B1FD" wp14:editId="30726153">
             <wp:extent cx="5759450" cy="963295"/>
             <wp:effectExtent l="0" t="0" r="0" b="8255"/>
             <wp:docPr id="1345579640" name="Imagen 41" descr="Imagen que contiene Forma&#10;&#10;El contenido generado por IA puede ser incorrecto."/>
@@ -8519,13 +8937,23 @@
     </w:p>
     <w:p>
       <w:r>
-        <w:t>Luego</w:t>
-      </w:r>
-      <w:r>
-        <w:t>,</w:t>
-      </w:r>
-      <w:r>
-        <w:t xml:space="preserve"> se incluye esa variable, junto con las variables creadas en otros objetos, en una variable que albergará todas las rutas definidas en la aplicación. O lo que es lo mismo, todas las asociaciones entre endpoints y lógicas que hay en el sistema.</w:t>
+        <w:t>Finalmente, todas estas agrupaciones se combinan en una variable global que representa el conjunto completo de rutas de la aplicación</w:t>
+      </w:r>
+      <w:r>
+        <w:t xml:space="preserve"> (</w:t>
+      </w:r>
+      <w:r>
+        <w:rPr>
+          <w:b/>
+          <w:bCs/>
+        </w:rPr>
+        <w:t>[SUSTITUIR POR NOMBRE DE LA FIGURA]</w:t>
+      </w:r>
+      <w:r>
+        <w:t>)</w:t>
+      </w:r>
+      <w:r>
+        <w:t xml:space="preserve">. </w:t>
       </w:r>
     </w:p>
     <w:p>
@@ -8534,7 +8962,7 @@
           <w:noProof/>
         </w:rPr>
         <w:drawing>
-          <wp:inline distT="0" distB="0" distL="0" distR="0" wp14:anchorId="1A10F560" wp14:editId="27528238">
+          <wp:inline distT="0" distB="0" distL="0" distR="0" wp14:anchorId="28BEA5F1" wp14:editId="39580C0F">
             <wp:extent cx="5759450" cy="3462655"/>
             <wp:effectExtent l="0" t="0" r="0" b="4445"/>
             <wp:docPr id="781736673" name="Imagen 40" descr="Texto&#10;&#10;El contenido generado por IA puede ser incorrecto."/>
@@ -8578,28 +9006,7 @@
     </w:p>
     <w:p>
       <w:r>
-        <w:lastRenderedPageBreak/>
-        <w:t xml:space="preserve">Finalmente, hay que pasarle la variable </w:t>
-      </w:r>
-      <w:r>
-        <w:rPr>
-          <w:i/>
-          <w:iCs/>
-        </w:rPr>
-        <w:t xml:space="preserve">httpRoutes </w:t>
-      </w:r>
-      <w:r>
-        <w:t xml:space="preserve">de la figura </w:t>
-      </w:r>
-      <w:r>
-        <w:rPr>
-          <w:b/>
-          <w:bCs/>
-        </w:rPr>
-        <w:t>[SUSTITUIR POR NOMBRE DE LA FIGURA]</w:t>
-      </w:r>
-      <w:r>
-        <w:t xml:space="preserve"> al </w:t>
+        <w:t xml:space="preserve">Esta variable se pasa como parámetro al </w:t>
       </w:r>
       <w:r>
         <w:rPr>
@@ -8609,7 +9016,7 @@
         <w:t>BlazeServerBuilder</w:t>
       </w:r>
       <w:r>
-        <w:t xml:space="preserve"> que se encuentra en el </w:t>
+        <w:t xml:space="preserve"> que aparece en el </w:t>
       </w:r>
       <w:r>
         <w:rPr>
@@ -8619,19 +9026,7 @@
         <w:t>Main</w:t>
       </w:r>
       <w:r>
-        <w:t xml:space="preserve"> de la aplicación.</w:t>
-      </w:r>
-    </w:p>
-    <w:p>
-      <w:r>
-        <w:rPr>
-          <w:b/>
-          <w:bCs/>
-        </w:rPr>
-        <w:t>[EXPLICAR MAIN Y BLAZESERVERBUILDER]</w:t>
-      </w:r>
-      <w:r>
-        <w:t>.</w:t>
+        <w:t xml:space="preserve"> del proyecto, que es el encargado de levantar el servidor, abrir el puerto configurado, y empezar a gestionar peticiones reales a través de todas las rutas definidas.</w:t>
       </w:r>
     </w:p>
     <w:p>
@@ -8640,9 +9035,9 @@
           <w:noProof/>
         </w:rPr>
         <w:drawing>
-          <wp:inline distT="0" distB="0" distL="0" distR="0" wp14:anchorId="0BAF3CE3" wp14:editId="577F39C8">
-            <wp:extent cx="5759450" cy="1905635"/>
-            <wp:effectExtent l="0" t="0" r="0" b="0"/>
+          <wp:inline distT="0" distB="0" distL="0" distR="0" wp14:anchorId="280FCAA1" wp14:editId="73C3E45E">
+            <wp:extent cx="5759450" cy="1762125"/>
+            <wp:effectExtent l="0" t="0" r="0" b="9525"/>
             <wp:docPr id="1246390468" name="Imagen 42" descr="Texto&#10;&#10;El contenido generado por IA puede ser incorrecto."/>
             <wp:cNvGraphicFramePr>
               <a:graphicFrameLocks xmlns:a="http://schemas.openxmlformats.org/drawingml/2006/main" noChangeAspect="1"/>
@@ -8669,7 +9064,7 @@
                   <pic:spPr>
                     <a:xfrm>
                       <a:off x="0" y="0"/>
-                      <a:ext cx="5759450" cy="1905635"/>
+                      <a:ext cx="5759450" cy="1762125"/>
                     </a:xfrm>
                     <a:prstGeom prst="rect">
                       <a:avLst/>
@@ -8683,6 +9078,269 @@
       </w:r>
     </w:p>
     <w:p>
+      <w:r>
+        <w:lastRenderedPageBreak/>
+        <w:t xml:space="preserve">El </w:t>
+      </w:r>
+      <w:r>
+        <w:rPr>
+          <w:i/>
+          <w:iCs/>
+        </w:rPr>
+        <w:t>Main</w:t>
+      </w:r>
+      <w:r>
+        <w:t xml:space="preserve"> del proyecto es el punto de entrada principal de la aplicación, y está definido extendiendo </w:t>
+      </w:r>
+      <w:r>
+        <w:rPr>
+          <w:i/>
+          <w:iCs/>
+        </w:rPr>
+        <w:t>IOApp</w:t>
+      </w:r>
+      <w:r>
+        <w:t xml:space="preserve">, una clase que ofrece una forma sencilla de lanzar programas basados en </w:t>
+      </w:r>
+      <w:r>
+        <w:rPr>
+          <w:i/>
+          <w:iCs/>
+        </w:rPr>
+        <w:t>IO</w:t>
+      </w:r>
+      <w:r>
+        <w:t xml:space="preserve">. En este caso, la función run se encarga de inicializar y ejecutar el servidor HTTP utilizando el método </w:t>
+      </w:r>
+      <w:r>
+        <w:rPr>
+          <w:i/>
+          <w:iCs/>
+        </w:rPr>
+        <w:t>BlazeServerBuilder[IO]</w:t>
+      </w:r>
+      <w:r>
+        <w:t>.</w:t>
+      </w:r>
+    </w:p>
+    <w:p>
+      <w:r>
+        <w:rPr>
+          <w:i/>
+          <w:iCs/>
+        </w:rPr>
+        <w:t>BlazeServerBuilder</w:t>
+      </w:r>
+      <w:r>
+        <w:t xml:space="preserve"> forma parte de http4s y permite crear servidores HTTP de forma declarativa, funcional y segura. En concreto, </w:t>
+      </w:r>
+      <w:r>
+        <w:rPr>
+          <w:i/>
+          <w:iCs/>
+        </w:rPr>
+        <w:t>BlazeServerBuilder</w:t>
+      </w:r>
+      <w:r>
+        <w:t>:</w:t>
+      </w:r>
+    </w:p>
+    <w:p>
+      <w:pPr>
+        <w:pStyle w:val="Prrafodelista"/>
+        <w:numPr>
+          <w:ilvl w:val="0"/>
+          <w:numId w:val="68"/>
+        </w:numPr>
+      </w:pPr>
+      <w:r>
+        <w:t>Permite configurar el host y puerto en el que el servidor escuchará (en este caso, "localhost" y el puerto 8080).</w:t>
+      </w:r>
+    </w:p>
+    <w:p>
+      <w:pPr>
+        <w:pStyle w:val="Prrafodelista"/>
+        <w:numPr>
+          <w:ilvl w:val="0"/>
+          <w:numId w:val="68"/>
+        </w:numPr>
+      </w:pPr>
+      <w:r>
+        <w:t xml:space="preserve">Recibe como parámetro la aplicación HTTP completa, que es el conjunto de rutas definido en </w:t>
+      </w:r>
+      <w:r>
+        <w:rPr>
+          <w:i/>
+          <w:iCs/>
+        </w:rPr>
+        <w:t>httpRoutes</w:t>
+      </w:r>
+      <w:r>
+        <w:t xml:space="preserve">, convertidas a un </w:t>
+      </w:r>
+      <w:r>
+        <w:rPr>
+          <w:i/>
+          <w:iCs/>
+        </w:rPr>
+        <w:t>HttpApp[IO]</w:t>
+      </w:r>
+      <w:r>
+        <w:t xml:space="preserve"> mediante </w:t>
+      </w:r>
+      <w:r>
+        <w:rPr>
+          <w:i/>
+          <w:iCs/>
+        </w:rPr>
+        <w:t>.orNotFound</w:t>
+      </w:r>
+      <w:r>
+        <w:t>.</w:t>
+      </w:r>
+    </w:p>
+    <w:p>
+      <w:pPr>
+        <w:pStyle w:val="Prrafodelista"/>
+        <w:numPr>
+          <w:ilvl w:val="0"/>
+          <w:numId w:val="68"/>
+        </w:numPr>
+      </w:pPr>
+      <w:r>
+        <w:t>Se encarga de gestionar las conexiones, recibir peticiones, ejecutar la lógica asociada a cada endpoint y devolver las respuestas correspondientes.</w:t>
+      </w:r>
+    </w:p>
+    <w:p>
+      <w:pPr>
+        <w:pStyle w:val="Prrafodelista"/>
+        <w:numPr>
+          <w:ilvl w:val="0"/>
+          <w:numId w:val="68"/>
+        </w:numPr>
+      </w:pPr>
+      <w:r>
+        <w:t xml:space="preserve">Utiliza </w:t>
+      </w:r>
+      <w:r>
+        <w:rPr>
+          <w:i/>
+          <w:iCs/>
+        </w:rPr>
+        <w:t>Blaze</w:t>
+      </w:r>
+      <w:r>
+        <w:t xml:space="preserve"> como motor HTTP subyacente, una implementación no bloqueante y eficiente que está bien integrada con el resto de la librería.</w:t>
+      </w:r>
+    </w:p>
+    <w:p>
+      <w:pPr>
+        <w:pStyle w:val="Prrafodelista"/>
+        <w:numPr>
+          <w:ilvl w:val="0"/>
+          <w:numId w:val="68"/>
+        </w:numPr>
+      </w:pPr>
+      <w:r>
+        <w:t xml:space="preserve">Se ejecuta dentro del contexto funcional de </w:t>
+      </w:r>
+      <w:r>
+        <w:rPr>
+          <w:i/>
+          <w:iCs/>
+        </w:rPr>
+        <w:t>IO</w:t>
+      </w:r>
+      <w:r>
+        <w:t>, por lo que toda su operación está controlada, sin efectos inesperados ni estados compartidos fuera del modelo de efectos.</w:t>
+      </w:r>
+    </w:p>
+    <w:p>
+      <w:r>
+        <w:t>El servidor arranca al ejecutar la cadena de instrucciones</w:t>
+      </w:r>
+      <w:r>
+        <w:t xml:space="preserve"> mostrada en la figura </w:t>
+      </w:r>
+      <w:r>
+        <w:rPr>
+          <w:b/>
+          <w:bCs/>
+        </w:rPr>
+        <w:t>[SUSTITUIR POR NOMBRE DE LA FIGURA]</w:t>
+      </w:r>
+      <w:r>
+        <w:t>.</w:t>
+      </w:r>
+    </w:p>
+    <w:p>
+      <w:r>
+        <w:t xml:space="preserve">Aquí, </w:t>
+      </w:r>
+      <w:r>
+        <w:rPr>
+          <w:i/>
+          <w:iCs/>
+        </w:rPr>
+        <w:t>.serve</w:t>
+      </w:r>
+      <w:r>
+        <w:t xml:space="preserve"> devuelve un stream de ejecución infinita (el servidor queda escuchando indefinidamente), que se compila y drena con </w:t>
+      </w:r>
+      <w:r>
+        <w:rPr>
+          <w:i/>
+          <w:iCs/>
+        </w:rPr>
+        <w:t>.compile.drain</w:t>
+      </w:r>
+      <w:r>
+        <w:t>, para finalmente devolver un código de salida correcto (</w:t>
+      </w:r>
+      <w:r>
+        <w:rPr>
+          <w:i/>
+          <w:iCs/>
+        </w:rPr>
+        <w:t>ExitCode.Success</w:t>
+      </w:r>
+      <w:r>
+        <w:t>) una vez terminado.</w:t>
+      </w:r>
+    </w:p>
+    <w:p>
+      <w:r>
+        <w:t xml:space="preserve">En resumen, </w:t>
+      </w:r>
+      <w:r>
+        <w:rPr>
+          <w:i/>
+          <w:iCs/>
+        </w:rPr>
+        <w:t>BlazeServerBuilder</w:t>
+      </w:r>
+      <w:r>
+        <w:t xml:space="preserve"> es el componente que, una vez configuradas todas las rutas y lógicas de la aplicación, se encarga de convertir esa estructura en un servidor HTTP real y funcional, listo para recibir y procesar peticiones externas. Su integración con http4s </w:t>
+      </w:r>
+      <w:r>
+        <w:t>e</w:t>
+      </w:r>
+      <w:r>
+        <w:t xml:space="preserve"> </w:t>
+      </w:r>
+      <w:r>
+        <w:rPr>
+          <w:i/>
+          <w:iCs/>
+        </w:rPr>
+        <w:t>IOApp</w:t>
+      </w:r>
+      <w:r>
+        <w:t xml:space="preserve"> permite que el resultado sea totalmente funcional, seguro, y alineado con los principios de diseño del resto del sistema.</w:t>
+      </w:r>
+    </w:p>
+    <w:p/>
+    <w:p>
       <w:pPr>
         <w:pStyle w:val="Ttulo3"/>
         <w:numPr>
@@ -8690,8 +9348,9 @@
           <w:numId w:val="63"/>
         </w:numPr>
       </w:pPr>
-      <w:bookmarkStart w:id="21" w:name="_Toc200610064"/>
-      <w:r>
+      <w:bookmarkStart w:id="21" w:name="_Toc200708280"/>
+      <w:r>
+        <w:lastRenderedPageBreak/>
         <w:t>Otros endpoints de utilidad</w:t>
       </w:r>
       <w:bookmarkEnd w:id="21"/>
@@ -8728,7 +9387,7 @@
           <w:numId w:val="64"/>
         </w:numPr>
       </w:pPr>
-      <w:bookmarkStart w:id="22" w:name="_Toc200610065"/>
+      <w:bookmarkStart w:id="22" w:name="_Toc200708281"/>
       <w:r>
         <w:t>Endpoint de tipo POST</w:t>
       </w:r>
@@ -8829,7 +9488,6 @@
     </w:p>
     <w:p>
       <w:r>
-        <w:lastRenderedPageBreak/>
         <w:t xml:space="preserve">El endpoint base, en este caso (así como en los siguientes) es </w:t>
       </w:r>
       <w:r>
@@ -8954,6 +9612,7 @@
         <w:rPr>
           <w:noProof/>
         </w:rPr>
+        <w:lastRenderedPageBreak/>
         <w:drawing>
           <wp:inline distT="0" distB="0" distL="0" distR="0" wp14:anchorId="07342AA6" wp14:editId="76BB33B3">
             <wp:extent cx="5759450" cy="824865"/>
@@ -9110,7 +9769,6 @@
         <w:rPr>
           <w:noProof/>
         </w:rPr>
-        <w:lastRenderedPageBreak/>
         <w:drawing>
           <wp:inline distT="0" distB="0" distL="0" distR="0" wp14:anchorId="0E4CA743" wp14:editId="4BD72641">
             <wp:extent cx="5759450" cy="1915160"/>
@@ -9234,6 +9892,7 @@
         <w:rPr>
           <w:noProof/>
         </w:rPr>
+        <w:lastRenderedPageBreak/>
         <w:drawing>
           <wp:inline distT="0" distB="0" distL="0" distR="0" wp14:anchorId="7CD66FAE" wp14:editId="3E128B73">
             <wp:extent cx="5759450" cy="398780"/>
@@ -9455,7 +10114,6 @@
         </w:numPr>
       </w:pPr>
       <w:r>
-        <w:lastRenderedPageBreak/>
         <w:t>Si es válido, se actualiza el usuario que ha creado el objeto, y, si esa operación se realiza con éxito, se actualiza el sistema de persistencia con la nueva reseña.</w:t>
       </w:r>
     </w:p>
@@ -9534,8 +10192,9 @@
           <w:iCs w:val="0"/>
         </w:rPr>
       </w:pPr>
-      <w:bookmarkStart w:id="23" w:name="_Toc200610066"/>
-      <w:r>
+      <w:bookmarkStart w:id="23" w:name="_Toc200708282"/>
+      <w:r>
+        <w:lastRenderedPageBreak/>
         <w:t>Endpoint de tipo PUT</w:t>
       </w:r>
       <w:bookmarkEnd w:id="23"/>
@@ -9653,7 +10312,6 @@
         <w:rPr>
           <w:noProof/>
         </w:rPr>
-        <w:lastRenderedPageBreak/>
         <w:drawing>
           <wp:inline distT="0" distB="0" distL="0" distR="0" wp14:anchorId="4F9BEFA0" wp14:editId="762148E1">
             <wp:extent cx="5759450" cy="2047875"/>
@@ -9810,6 +10468,7 @@
         <w:rPr>
           <w:noProof/>
         </w:rPr>
+        <w:lastRenderedPageBreak/>
         <w:drawing>
           <wp:inline distT="0" distB="0" distL="0" distR="0" wp14:anchorId="13A267A8" wp14:editId="21ECD153">
             <wp:extent cx="5759450" cy="144145"/>
@@ -9936,7 +10595,6 @@
         <w:rPr>
           <w:noProof/>
         </w:rPr>
-        <w:lastRenderedPageBreak/>
         <w:drawing>
           <wp:inline distT="0" distB="0" distL="0" distR="0" wp14:anchorId="0926A319" wp14:editId="02A57F06">
             <wp:extent cx="5759450" cy="2611755"/>
@@ -9992,7 +10650,7 @@
           <w:iCs w:val="0"/>
         </w:rPr>
       </w:pPr>
-      <w:bookmarkStart w:id="24" w:name="_Toc200610067"/>
+      <w:bookmarkStart w:id="24" w:name="_Toc200708283"/>
       <w:r>
         <w:t>Endpoint de tipo DELETE</w:t>
       </w:r>
@@ -10038,6 +10696,7 @@
         <w:rPr>
           <w:noProof/>
         </w:rPr>
+        <w:lastRenderedPageBreak/>
         <w:drawing>
           <wp:inline distT="0" distB="0" distL="0" distR="0" wp14:anchorId="3F885CB5" wp14:editId="69044E14">
             <wp:extent cx="5759450" cy="1217295"/>
@@ -10176,7 +10835,6 @@
         <w:rPr>
           <w:noProof/>
         </w:rPr>
-        <w:lastRenderedPageBreak/>
         <w:drawing>
           <wp:inline distT="0" distB="0" distL="0" distR="0" wp14:anchorId="6C233A26" wp14:editId="0B8F04C2">
             <wp:extent cx="5759450" cy="1931035"/>
@@ -10250,6 +10908,7 @@
         <w:rPr>
           <w:noProof/>
         </w:rPr>
+        <w:lastRenderedPageBreak/>
         <w:drawing>
           <wp:inline distT="0" distB="0" distL="0" distR="0" wp14:anchorId="531BAD6D" wp14:editId="28BC1FCE">
             <wp:extent cx="5759450" cy="1997710"/>
@@ -10294,13 +10953,11 @@
       </w:r>
     </w:p>
     <w:p/>
-    <w:p/>
-    <w:p/>
     <w:p>
       <w:pPr>
         <w:pStyle w:val="Ttulo2"/>
       </w:pPr>
-      <w:bookmarkStart w:id="25" w:name="_Toc200610068"/>
+      <w:bookmarkStart w:id="25" w:name="_Toc200708284"/>
       <w:r>
         <w:t>Implementación de endpoints que se comunican con servicios externos</w:t>
       </w:r>
@@ -10313,7 +10970,6 @@
     </w:p>
     <w:p>
       <w:r>
-        <w:lastRenderedPageBreak/>
         <w:t xml:space="preserve">Se han contemplado algunas opciones, como la de crear archivos de prueba con datos inventados, o bien con información real resultante de llevar a cabo un proceso de </w:t>
       </w:r>
       <w:r>
@@ -10370,6 +11026,7 @@
         <w:rPr>
           <w:noProof/>
         </w:rPr>
+        <w:lastRenderedPageBreak/>
         <w:drawing>
           <wp:inline distT="0" distB="0" distL="0" distR="0" wp14:anchorId="3953583C" wp14:editId="7BDC21FB">
             <wp:extent cx="5759450" cy="947420"/>
@@ -10536,7 +11193,6 @@
         <w:rPr>
           <w:noProof/>
         </w:rPr>
-        <w:lastRenderedPageBreak/>
         <w:drawing>
           <wp:inline distT="0" distB="0" distL="0" distR="0" wp14:anchorId="4691CCEA" wp14:editId="626F0BCA">
             <wp:extent cx="5759450" cy="794385"/>
@@ -10665,6 +11321,7 @@
         <w:rPr>
           <w:noProof/>
         </w:rPr>
+        <w:lastRenderedPageBreak/>
         <w:drawing>
           <wp:inline distT="0" distB="0" distL="0" distR="0" wp14:anchorId="2F5BBF54" wp14:editId="7E9123F0">
             <wp:extent cx="5759450" cy="3963670"/>
@@ -10740,11 +11397,7 @@
         <w:t>EndpointOutput</w:t>
       </w:r>
       <w:r>
-        <w:t xml:space="preserve">. El proceso es el mismo que el que se sigue en la sección “2.1.3. Parámetros de E/S y códecs”, </w:t>
-      </w:r>
-      <w:r>
-        <w:lastRenderedPageBreak/>
-        <w:t xml:space="preserve">así como también en la sección “2.4.2. Endpoint de tipo PUT” (cito esta sección en lo referente a la creación del códec para las conversiones </w:t>
+        <w:t xml:space="preserve">. El proceso es el mismo que el que se sigue en la sección “2.1.3. Parámetros de E/S y códecs”, así como también en la sección “2.4.2. Endpoint de tipo PUT” (cito esta sección en lo referente a la creación del códec para las conversiones </w:t>
       </w:r>
       <w:r>
         <w:t xml:space="preserve">entre </w:t>
@@ -10779,6 +11432,7 @@
         <w:rPr>
           <w:noProof/>
         </w:rPr>
+        <w:lastRenderedPageBreak/>
         <w:drawing>
           <wp:inline distT="0" distB="0" distL="0" distR="0" wp14:anchorId="29512757" wp14:editId="6E7506EB">
             <wp:extent cx="5759450" cy="5183505"/>
@@ -10864,13 +11518,7 @@
           <w:rPr>
             <w:rStyle w:val="Hipervnculo"/>
           </w:rPr>
-          <w:t>https://api.themoviedb.org/3</w:t>
-        </w:r>
-        <w:r>
-          <w:rPr>
-            <w:rStyle w:val="Hipervnculo"/>
-          </w:rPr>
-          <w:t>/movie/{movie_id}</w:t>
+          <w:t>https://api.themoviedb.org/3/movie/{movie_id}</w:t>
         </w:r>
       </w:hyperlink>
       <w:r>
@@ -10879,7 +11527,6 @@
     </w:p>
     <w:p>
       <w:r>
-        <w:lastRenderedPageBreak/>
         <w:t xml:space="preserve">Por otro lado, se define el método </w:t>
       </w:r>
       <w:r>
@@ -10890,7 +11537,13 @@
         <w:t>executeRequest</w:t>
       </w:r>
       <w:r>
-        <w:t>, que recibe como parámetros el endpoint de la solicitud que se quiere realizar, y el identificador del recurso que se desea obtener; y que devuelve el objeto resultante de la petición a TMDB, ya sea una película, una serie, etc.</w:t>
+        <w:t>, que recibe como parámetros el endpoint de la solicitud que se quiere realizar, y el identificador del recurso que se desea obtener; y que devuelve el objeto resultante de la petición a TMDB</w:t>
+      </w:r>
+      <w:r>
+        <w:t>, o un error en caso de que algo haya salido mal</w:t>
+      </w:r>
+      <w:r>
+        <w:t>.</w:t>
       </w:r>
     </w:p>
     <w:p>
@@ -10905,6 +11558,7 @@
           <w:b/>
           <w:bCs/>
         </w:rPr>
+        <w:lastRenderedPageBreak/>
         <w:t>[EXPLICAR LO DEL EMBERCLIENTBUILDER</w:t>
       </w:r>
       <w:r>
@@ -10912,66 +11566,567 @@
           <w:b/>
           <w:bCs/>
         </w:rPr>
-        <w:t xml:space="preserve"> TODO EL CÓDIGO EN GENERAL. PENSAR EN SI APROVECHO O NO LO QUE HAY JUSTO A CONTINUACIÓN</w:t>
+        <w:t>,</w:t>
       </w:r>
       <w:r>
         <w:rPr>
           <w:b/>
           <w:bCs/>
         </w:rPr>
-        <w:t>]</w:t>
+        <w:t xml:space="preserve"> TODO EL CÓDIGO EN GENERAL. PENSAR EN SI APROVECHO O NO LO QUE HAY JUSTO A CONTINUACIÓN</w:t>
       </w:r>
       <w:r>
         <w:rPr>
           <w:b/>
           <w:bCs/>
         </w:rPr>
-        <w:t>.</w:t>
-      </w:r>
-    </w:p>
-    <w:p>
-      <w:pPr>
+        <w:t>]</w:t>
+      </w:r>
+      <w:r>
         <w:rPr>
           <w:b/>
           <w:bCs/>
         </w:rPr>
-      </w:pPr>
-      <w:r>
-        <w:t>Por otra parte, se comprueba que el identificador de recurso pasado como parámetro al objeto coincida</w:t>
-      </w:r>
-      <w:r>
-        <w:t xml:space="preserve"> </w:t>
-      </w:r>
-      <w:r>
-        <w:t xml:space="preserve">en tipo con el que debería ser el segundo parámetro del endpoint que se va a utilizar. El resultado de esta </w:t>
-      </w:r>
-      <w:r>
-        <w:t>comprobación</w:t>
-      </w:r>
-      <w:r>
-        <w:t xml:space="preserve"> ya sea el objeto recibido de la API en caso de comprobación correcta, o un error en caso de comprobación incorrecta, se recoge en la constante </w:t>
-      </w:r>
-      <w:r>
-        <w:rPr>
-          <w:i/>
-          <w:iCs/>
-        </w:rPr>
-        <w:t>requestResult</w:t>
-      </w:r>
-      <w:r>
-        <w:t xml:space="preserve">. </w:t>
+        <w:t>.</w:t>
+      </w:r>
+    </w:p>
+    <w:p>
+      <w:r>
+        <w:t xml:space="preserve">Para poder realizar las peticiones HTTP a los servicios externos, se hace uso del cliente </w:t>
+      </w:r>
+      <w:r>
+        <w:rPr>
+          <w:i/>
+          <w:iCs/>
+        </w:rPr>
+        <w:t>Ember</w:t>
+      </w:r>
+      <w:r>
+        <w:t xml:space="preserve">, que forma parte de la librería http4s. En concreto, se utiliza </w:t>
+      </w:r>
+      <w:r>
+        <w:rPr>
+          <w:i/>
+          <w:iCs/>
+        </w:rPr>
+        <w:t>EmberClientBuilder</w:t>
+      </w:r>
+      <w:r>
+        <w:t xml:space="preserve">, una clase que permite construir clientes HTTP ligeros, eficientes y fácilmente integrables en contextos funcionales como </w:t>
+      </w:r>
+      <w:r>
+        <w:rPr>
+          <w:i/>
+          <w:iCs/>
+        </w:rPr>
+        <w:t>IO</w:t>
+      </w:r>
+      <w:r>
+        <w:t>.</w:t>
+      </w:r>
+    </w:p>
+    <w:p>
+      <w:r>
+        <w:t xml:space="preserve">En el método </w:t>
+      </w:r>
+      <w:r>
+        <w:rPr>
+          <w:i/>
+          <w:iCs/>
+        </w:rPr>
+        <w:t>executeRequest</w:t>
+      </w:r>
+      <w:r>
+        <w:t xml:space="preserve">, lo primero que se hace es construir el cliente HTTP mediante el </w:t>
+      </w:r>
+      <w:r>
+        <w:t xml:space="preserve">fragmento mostrado en la figura </w:t>
       </w:r>
       <w:r>
         <w:rPr>
           <w:b/>
           <w:bCs/>
         </w:rPr>
-        <w:t>[¿APROVECHO ESTO?]</w:t>
-      </w:r>
-    </w:p>
-    <w:p>
-      <w:r>
-        <w:t xml:space="preserve">Para aplicar todo lo visto anteriormente en esta sección, únicamente hace falta realizar una llamada a </w:t>
+        <w:t>[SUSTITUIR POR NOMBRE DE LA FIGURA]</w:t>
+      </w:r>
+      <w:r>
+        <w:t>.</w:t>
+      </w:r>
+    </w:p>
+    <w:p>
+      <w:r>
+        <w:rPr>
+          <w:noProof/>
+        </w:rPr>
+        <w:drawing>
+          <wp:inline distT="0" distB="0" distL="0" distR="0" wp14:anchorId="1D4C157C" wp14:editId="7B9F674D">
+            <wp:extent cx="5759450" cy="780415"/>
+            <wp:effectExtent l="0" t="0" r="0" b="635"/>
+            <wp:docPr id="1646161380" name="Imagen 1" descr="Imagen que contiene Interfaz de usuario gráfica&#10;&#10;El contenido generado por IA puede ser incorrecto."/>
+            <wp:cNvGraphicFramePr>
+              <a:graphicFrameLocks xmlns:a="http://schemas.openxmlformats.org/drawingml/2006/main" noChangeAspect="1"/>
+            </wp:cNvGraphicFramePr>
+            <a:graphic xmlns:a="http://schemas.openxmlformats.org/drawingml/2006/main">
+              <a:graphicData uri="http://schemas.openxmlformats.org/drawingml/2006/picture">
+                <pic:pic xmlns:pic="http://schemas.openxmlformats.org/drawingml/2006/picture">
+                  <pic:nvPicPr>
+                    <pic:cNvPr id="1646161380" name="Imagen 1" descr="Imagen que contiene Interfaz de usuario gráfica&#10;&#10;El contenido generado por IA puede ser incorrecto."/>
+                    <pic:cNvPicPr/>
+                  </pic:nvPicPr>
+                  <pic:blipFill>
+                    <a:blip r:embed="rId69">
+                      <a:extLst>
+                        <a:ext uri="{28A0092B-C50C-407E-A947-70E740481C1C}">
+                          <a14:useLocalDpi xmlns:a14="http://schemas.microsoft.com/office/drawing/2010/main" val="0"/>
+                        </a:ext>
+                      </a:extLst>
+                    </a:blip>
+                    <a:stretch>
+                      <a:fillRect/>
+                    </a:stretch>
+                  </pic:blipFill>
+                  <pic:spPr>
+                    <a:xfrm>
+                      <a:off x="0" y="0"/>
+                      <a:ext cx="5759450" cy="780415"/>
+                    </a:xfrm>
+                    <a:prstGeom prst="rect">
+                      <a:avLst/>
+                    </a:prstGeom>
+                  </pic:spPr>
+                </pic:pic>
+              </a:graphicData>
+            </a:graphic>
+          </wp:inline>
+        </w:drawing>
+      </w:r>
+    </w:p>
+    <w:p>
+      <w:r>
+        <w:t>Aquí se define una configuración básica para el cliente: se indica el tamaño máximo permitido para las respuestas (</w:t>
+      </w:r>
+      <w:r>
+        <w:rPr>
+          <w:i/>
+          <w:iCs/>
+        </w:rPr>
+        <w:t>responseMaxSize</w:t>
+      </w:r>
+      <w:r>
+        <w:t>) y un tiempo máximo de espera (</w:t>
+      </w:r>
+      <w:r>
+        <w:rPr>
+          <w:i/>
+          <w:iCs/>
+        </w:rPr>
+        <w:t>timeout</w:t>
+      </w:r>
+      <w:r>
+        <w:t xml:space="preserve">) por cada petición. Este cliente se crea como una </w:t>
+      </w:r>
+      <w:r>
+        <w:rPr>
+          <w:i/>
+          <w:iCs/>
+        </w:rPr>
+        <w:t>Resource</w:t>
+      </w:r>
+      <w:r>
+        <w:t>, lo que permite controlar automáticamente su apertura y liberación, evitando así problemas relacionados con fugas de memoria o conexiones abiertas de forma indefinida.</w:t>
+      </w:r>
+    </w:p>
+    <w:p>
+      <w:r>
+        <w:t xml:space="preserve">A continuación, el método </w:t>
+      </w:r>
+      <w:r>
+        <w:rPr>
+          <w:i/>
+          <w:iCs/>
+        </w:rPr>
+        <w:t>executeRequest</w:t>
+      </w:r>
+      <w:r>
+        <w:t xml:space="preserve"> debe adaptarse a la flexibilidad de los endpoints definidos con Tapir. Dado que no todos los endpoints tienen el mismo número ni tipo de parámetros, se utiliza una estructura de </w:t>
+      </w:r>
+      <w:r>
+        <w:rPr>
+          <w:i/>
+          <w:iCs/>
+        </w:rPr>
+        <w:t>pattern matching</w:t>
+      </w:r>
+      <w:r>
+        <w:t xml:space="preserve"> para asegurarse de que el endpoint recibido y el </w:t>
+      </w:r>
+      <w:r>
+        <w:t>recurso</w:t>
+      </w:r>
+      <w:r>
+        <w:t xml:space="preserve"> proporcionado como argumentos coinciden en su estructura</w:t>
+      </w:r>
+      <w:r>
+        <w:t xml:space="preserve"> </w:t>
+      </w:r>
+      <w:r>
+        <w:t xml:space="preserve">(figura </w:t>
+      </w:r>
+      <w:r>
+        <w:rPr>
+          <w:b/>
+          <w:bCs/>
+        </w:rPr>
+        <w:t>[SUSTITUIR POR NOMBRE DE LA FIGURA]</w:t>
+      </w:r>
+      <w:r>
+        <w:t>).</w:t>
+      </w:r>
+    </w:p>
+    <w:p>
+      <w:r>
+        <w:rPr>
+          <w:noProof/>
+        </w:rPr>
+        <w:drawing>
+          <wp:inline distT="0" distB="0" distL="0" distR="0" wp14:anchorId="41469A09" wp14:editId="25951CB5">
+            <wp:extent cx="5759450" cy="1494155"/>
+            <wp:effectExtent l="0" t="0" r="0" b="0"/>
+            <wp:docPr id="2133605753" name="Imagen 2" descr="Texto&#10;&#10;El contenido generado por IA puede ser incorrecto."/>
+            <wp:cNvGraphicFramePr>
+              <a:graphicFrameLocks xmlns:a="http://schemas.openxmlformats.org/drawingml/2006/main" noChangeAspect="1"/>
+            </wp:cNvGraphicFramePr>
+            <a:graphic xmlns:a="http://schemas.openxmlformats.org/drawingml/2006/main">
+              <a:graphicData uri="http://schemas.openxmlformats.org/drawingml/2006/picture">
+                <pic:pic xmlns:pic="http://schemas.openxmlformats.org/drawingml/2006/picture">
+                  <pic:nvPicPr>
+                    <pic:cNvPr id="2133605753" name="Imagen 2" descr="Texto&#10;&#10;El contenido generado por IA puede ser incorrecto."/>
+                    <pic:cNvPicPr/>
+                  </pic:nvPicPr>
+                  <pic:blipFill>
+                    <a:blip r:embed="rId70">
+                      <a:extLst>
+                        <a:ext uri="{28A0092B-C50C-407E-A947-70E740481C1C}">
+                          <a14:useLocalDpi xmlns:a14="http://schemas.microsoft.com/office/drawing/2010/main" val="0"/>
+                        </a:ext>
+                      </a:extLst>
+                    </a:blip>
+                    <a:stretch>
+                      <a:fillRect/>
+                    </a:stretch>
+                  </pic:blipFill>
+                  <pic:spPr>
+                    <a:xfrm>
+                      <a:off x="0" y="0"/>
+                      <a:ext cx="5759450" cy="1494155"/>
+                    </a:xfrm>
+                    <a:prstGeom prst="rect">
+                      <a:avLst/>
+                    </a:prstGeom>
+                  </pic:spPr>
+                </pic:pic>
+              </a:graphicData>
+            </a:graphic>
+          </wp:inline>
+        </w:drawing>
+      </w:r>
+    </w:p>
+    <w:p>
+      <w:r>
+        <w:lastRenderedPageBreak/>
+        <w:t xml:space="preserve">Cada uno de los casos del match construye, si corresponde, una función que genera la solicitud HTTP a partir del endpoint. Esto se hace utilizando el objeto </w:t>
+      </w:r>
+      <w:r>
+        <w:rPr>
+          <w:i/>
+          <w:iCs/>
+        </w:rPr>
+        <w:t>Http4sClientInterpreter</w:t>
+      </w:r>
+      <w:r>
+        <w:t xml:space="preserve">, que convierte un endpoint de Tapir en una función que, dados los parámetros adecuados, genera una </w:t>
+      </w:r>
+      <w:r>
+        <w:rPr>
+          <w:i/>
+          <w:iCs/>
+        </w:rPr>
+        <w:t>Request[IO]</w:t>
+      </w:r>
+      <w:r>
+        <w:t xml:space="preserve"> y una función para decodificar la respuesta</w:t>
+      </w:r>
+      <w:r>
+        <w:t xml:space="preserve"> </w:t>
+      </w:r>
+      <w:r>
+        <w:t xml:space="preserve">(figura </w:t>
+      </w:r>
+      <w:r>
+        <w:rPr>
+          <w:b/>
+          <w:bCs/>
+        </w:rPr>
+        <w:t>[SUSTITUIR POR NOMBRE DE LA FIGURA]</w:t>
+      </w:r>
+      <w:r>
+        <w:t>).</w:t>
+      </w:r>
+    </w:p>
+    <w:p>
+      <w:pPr>
+        <w:rPr>
+          <w:b/>
+          <w:bCs/>
+        </w:rPr>
+      </w:pPr>
+      <w:r>
+        <w:rPr>
+          <w:b/>
+          <w:bCs/>
+          <w:noProof/>
+        </w:rPr>
+        <w:drawing>
+          <wp:inline distT="0" distB="0" distL="0" distR="0" wp14:anchorId="114F2B0B" wp14:editId="2E2E14C3">
+            <wp:extent cx="5759450" cy="122555"/>
+            <wp:effectExtent l="0" t="0" r="0" b="0"/>
+            <wp:docPr id="410103094" name="Imagen 3"/>
+            <wp:cNvGraphicFramePr>
+              <a:graphicFrameLocks xmlns:a="http://schemas.openxmlformats.org/drawingml/2006/main" noChangeAspect="1"/>
+            </wp:cNvGraphicFramePr>
+            <a:graphic xmlns:a="http://schemas.openxmlformats.org/drawingml/2006/main">
+              <a:graphicData uri="http://schemas.openxmlformats.org/drawingml/2006/picture">
+                <pic:pic xmlns:pic="http://schemas.openxmlformats.org/drawingml/2006/picture">
+                  <pic:nvPicPr>
+                    <pic:cNvPr id="410103094" name="Imagen 410103094"/>
+                    <pic:cNvPicPr/>
+                  </pic:nvPicPr>
+                  <pic:blipFill>
+                    <a:blip r:embed="rId71">
+                      <a:extLst>
+                        <a:ext uri="{28A0092B-C50C-407E-A947-70E740481C1C}">
+                          <a14:useLocalDpi xmlns:a14="http://schemas.microsoft.com/office/drawing/2010/main" val="0"/>
+                        </a:ext>
+                      </a:extLst>
+                    </a:blip>
+                    <a:stretch>
+                      <a:fillRect/>
+                    </a:stretch>
+                  </pic:blipFill>
+                  <pic:spPr>
+                    <a:xfrm>
+                      <a:off x="0" y="0"/>
+                      <a:ext cx="5759450" cy="122555"/>
+                    </a:xfrm>
+                    <a:prstGeom prst="rect">
+                      <a:avLst/>
+                    </a:prstGeom>
+                  </pic:spPr>
+                </pic:pic>
+              </a:graphicData>
+            </a:graphic>
+          </wp:inline>
+        </w:drawing>
+      </w:r>
+    </w:p>
+    <w:p>
+      <w:r>
+        <w:t xml:space="preserve">Si el tipo de parámetro no coincide con el esperado por el endpoint (por ejemplo, se proporciona un identificador de serie donde debería ir uno de película), se devuelve directamente un error </w:t>
+      </w:r>
+      <w:r>
+        <w:rPr>
+          <w:i/>
+          <w:iCs/>
+        </w:rPr>
+        <w:t>BadRequest</w:t>
+      </w:r>
+      <w:r>
+        <w:t>.</w:t>
+      </w:r>
+    </w:p>
+    <w:p>
+      <w:r>
+        <w:t>Una vez construida correctamente la solicitud (</w:t>
+      </w:r>
+      <w:r>
+        <w:rPr>
+          <w:i/>
+          <w:iCs/>
+        </w:rPr>
+        <w:t>userRequest</w:t>
+      </w:r>
+      <w:r>
+        <w:t>) y su correspondiente función de respuesta (</w:t>
+      </w:r>
+      <w:r>
+        <w:rPr>
+          <w:i/>
+          <w:iCs/>
+        </w:rPr>
+        <w:t>parseResponse</w:t>
+      </w:r>
+      <w:r>
+        <w:t>), se utiliza el cliente HTTP para lanzar la petición</w:t>
+      </w:r>
+      <w:r>
+        <w:t xml:space="preserve">, tal y como se </w:t>
+      </w:r>
+      <w:r>
+        <w:t>muestra</w:t>
+      </w:r>
+      <w:r>
+        <w:t xml:space="preserve"> en la </w:t>
+      </w:r>
+      <w:r>
+        <w:t xml:space="preserve">figura </w:t>
+      </w:r>
+      <w:r>
+        <w:rPr>
+          <w:b/>
+          <w:bCs/>
+        </w:rPr>
+        <w:t>[SUSTITUIR POR NOMBRE DE LA FIGURA]</w:t>
+      </w:r>
+      <w:r>
+        <w:t>.</w:t>
+      </w:r>
+    </w:p>
+    <w:p>
+      <w:r>
+        <w:rPr>
+          <w:noProof/>
+        </w:rPr>
+        <w:drawing>
+          <wp:inline distT="0" distB="0" distL="0" distR="0" wp14:anchorId="3290302F" wp14:editId="5881B577">
+            <wp:extent cx="5759450" cy="2359660"/>
+            <wp:effectExtent l="0" t="0" r="0" b="2540"/>
+            <wp:docPr id="606552166" name="Imagen 4" descr="Texto&#10;&#10;El contenido generado por IA puede ser incorrecto."/>
+            <wp:cNvGraphicFramePr>
+              <a:graphicFrameLocks xmlns:a="http://schemas.openxmlformats.org/drawingml/2006/main" noChangeAspect="1"/>
+            </wp:cNvGraphicFramePr>
+            <a:graphic xmlns:a="http://schemas.openxmlformats.org/drawingml/2006/main">
+              <a:graphicData uri="http://schemas.openxmlformats.org/drawingml/2006/picture">
+                <pic:pic xmlns:pic="http://schemas.openxmlformats.org/drawingml/2006/picture">
+                  <pic:nvPicPr>
+                    <pic:cNvPr id="606552166" name="Imagen 4" descr="Texto&#10;&#10;El contenido generado por IA puede ser incorrecto."/>
+                    <pic:cNvPicPr/>
+                  </pic:nvPicPr>
+                  <pic:blipFill>
+                    <a:blip r:embed="rId72">
+                      <a:extLst>
+                        <a:ext uri="{28A0092B-C50C-407E-A947-70E740481C1C}">
+                          <a14:useLocalDpi xmlns:a14="http://schemas.microsoft.com/office/drawing/2010/main" val="0"/>
+                        </a:ext>
+                      </a:extLst>
+                    </a:blip>
+                    <a:stretch>
+                      <a:fillRect/>
+                    </a:stretch>
+                  </pic:blipFill>
+                  <pic:spPr>
+                    <a:xfrm>
+                      <a:off x="0" y="0"/>
+                      <a:ext cx="5759450" cy="2359660"/>
+                    </a:xfrm>
+                    <a:prstGeom prst="rect">
+                      <a:avLst/>
+                    </a:prstGeom>
+                  </pic:spPr>
+                </pic:pic>
+              </a:graphicData>
+            </a:graphic>
+          </wp:inline>
+        </w:drawing>
+      </w:r>
+    </w:p>
+    <w:p>
+      <w:r>
+        <w:t xml:space="preserve">Aquí se hace uso de </w:t>
+      </w:r>
+      <w:r>
+        <w:rPr>
+          <w:i/>
+          <w:iCs/>
+        </w:rPr>
+        <w:t>use</w:t>
+      </w:r>
+      <w:r>
+        <w:t xml:space="preserve"> dos veces: primero para abrir y cerrar correctamente el cliente HTTP (</w:t>
+      </w:r>
+      <w:r>
+        <w:rPr>
+          <w:i/>
+          <w:iCs/>
+        </w:rPr>
+        <w:t>httpClient</w:t>
+      </w:r>
+      <w:r>
+        <w:t>), y después para hacer lo mismo con la respuesta (</w:t>
+      </w:r>
+      <w:r>
+        <w:rPr>
+          <w:i/>
+          <w:iCs/>
+        </w:rPr>
+        <w:t>response</w:t>
+      </w:r>
+      <w:r>
+        <w:t xml:space="preserve">). Esto garantiza que no se mantiene ninguna conexión más tiempo del necesario. Una vez obtenida la respuesta, se intenta decodificar usando </w:t>
+      </w:r>
+      <w:r>
+        <w:rPr>
+          <w:i/>
+          <w:iCs/>
+        </w:rPr>
+        <w:t>parseResponse</w:t>
+      </w:r>
+      <w:r>
+        <w:t>.</w:t>
+      </w:r>
+    </w:p>
+    <w:p>
+      <w:r>
+        <w:t xml:space="preserve">El resultado de esa operación puede ser diverso: puede tratarse de un valor decodificado correctamente, de un error de usuario que ha sido capturado por el endpoint, o bien de un fallo en la propia decodificación. Cada uno de estos casos se recoge y se encapsula dentro de un </w:t>
+      </w:r>
+      <w:r>
+        <w:rPr>
+          <w:i/>
+          <w:iCs/>
+        </w:rPr>
+        <w:t>Either[UserError, O]</w:t>
+      </w:r>
+      <w:r>
+        <w:t>, lo cual permite propagar el resultado (ya sea válido o erróneo) hacia el exterior de forma segura.</w:t>
+      </w:r>
+    </w:p>
+    <w:p>
+      <w:pPr>
+        <w:rPr>
+          <w:b/>
+          <w:bCs/>
+        </w:rPr>
+      </w:pPr>
+      <w:r>
+        <w:lastRenderedPageBreak/>
+        <w:t xml:space="preserve">Finalmente, ante cualquier error inesperado (por ejemplo, fallo de conexión, error del servidor externo, etc.), se captura la excepción y se transforma en un error </w:t>
+      </w:r>
+      <w:r>
+        <w:rPr>
+          <w:i/>
+          <w:iCs/>
+        </w:rPr>
+        <w:t>Unknown</w:t>
+      </w:r>
+      <w:r>
+        <w:t>, con un mensaje informativo para facilitar su trazabilidad.</w:t>
+      </w:r>
+    </w:p>
+    <w:p>
+      <w:r>
+        <w:t>Por último, p</w:t>
+      </w:r>
+      <w:r>
+        <w:t xml:space="preserve">ara aplicar todo lo visto anteriormente en esta sección, únicamente hace falta realizar una llamada a </w:t>
       </w:r>
       <w:r>
         <w:rPr>
@@ -11015,7 +12170,7 @@
                     <pic:cNvPicPr/>
                   </pic:nvPicPr>
                   <pic:blipFill>
-                    <a:blip r:embed="rId69">
+                    <a:blip r:embed="rId73">
                       <a:extLst>
                         <a:ext uri="{28A0092B-C50C-407E-A947-70E740481C1C}">
                           <a14:useLocalDpi xmlns:a14="http://schemas.microsoft.com/office/drawing/2010/main" val="0"/>
@@ -11044,23 +12199,23 @@
     </w:p>
     <w:p>
       <w:r>
+        <w:t xml:space="preserve">Después, simplemente habría que recoger el resultado de la solicitud al servicio externo y procesarlo dentro de la lógica implementada para un endpoint del dominio propio de la aplicación. En el ejemplo mostrado, lo que se está haciendo es crear un objeto </w:t>
+      </w:r>
+      <w:r>
+        <w:rPr>
+          <w:i/>
+          <w:iCs/>
+        </w:rPr>
+        <w:t>Movie</w:t>
+      </w:r>
+      <w:r>
+        <w:t xml:space="preserve"> a partir de la información que TMDB tiene de la película solicitada, de sus créditos y de películas similares y recomendadas.</w:t>
+      </w:r>
+    </w:p>
+    <w:p/>
+    <w:p>
+      <w:r>
         <w:lastRenderedPageBreak/>
-        <w:t xml:space="preserve">Después, simplemente habría que recoger el resultado de la solicitud al servicio externo y procesarlo dentro de la lógica implementada para un endpoint del dominio propio de la aplicación. En el ejemplo mostrado, lo que se está haciendo es crear un objeto </w:t>
-      </w:r>
-      <w:r>
-        <w:rPr>
-          <w:i/>
-          <w:iCs/>
-        </w:rPr>
-        <w:t>Movie</w:t>
-      </w:r>
-      <w:r>
-        <w:t xml:space="preserve"> a partir de la información que TMDB tiene de la película solicitada, de sus créditos y de películas similares y recomendadas.</w:t>
-      </w:r>
-    </w:p>
-    <w:p/>
-    <w:p>
-      <w:r>
         <w:br w:type="page"/>
       </w:r>
     </w:p>
@@ -11068,7 +12223,7 @@
       <w:pPr>
         <w:pStyle w:val="Ttulo1"/>
       </w:pPr>
-      <w:bookmarkStart w:id="26" w:name="_Toc200610069"/>
+      <w:bookmarkStart w:id="26" w:name="_Toc200708285"/>
       <w:r>
         <w:lastRenderedPageBreak/>
         <w:t>Experimentos y validación</w:t>
@@ -11102,7 +12257,7 @@
           <w:lang w:val="en-GB"/>
         </w:rPr>
       </w:pPr>
-      <w:bookmarkStart w:id="27" w:name="_Toc200610070"/>
+      <w:bookmarkStart w:id="27" w:name="_Toc200708286"/>
       <w:r>
         <w:rPr>
           <w:lang w:val="en-GB"/>
@@ -11148,7 +12303,7 @@
           <w:numId w:val="0"/>
         </w:numPr>
       </w:pPr>
-      <w:bookmarkStart w:id="28" w:name="_Toc200610071"/>
+      <w:bookmarkStart w:id="28" w:name="_Toc200708287"/>
       <w:r>
         <w:lastRenderedPageBreak/>
         <w:t>A</w:t>
@@ -11164,7 +12319,7 @@
       </w:r>
     </w:p>
     <w:sectPr>
-      <w:footerReference w:type="default" r:id="rId70"/>
+      <w:footerReference w:type="default" r:id="rId74"/>
       <w:pgSz w:w="11906" w:h="16838" w:code="9"/>
       <w:pgMar w:top="1418" w:right="1418" w:bottom="1418" w:left="1418" w:header="709" w:footer="709" w:gutter="0"/>
       <w:pgNumType w:start="0"/>
@@ -11859,6 +13014,155 @@
     </w:lvl>
   </w:abstractNum>
   <w:abstractNum w:abstractNumId="5" w15:restartNumberingAfterBreak="0">
+    <w:nsid w:val="06C15D64"/>
+    <w:multiLevelType w:val="multilevel"/>
+    <w:tmpl w:val="31F25B7C"/>
+    <w:lvl w:ilvl="0">
+      <w:start w:val="1"/>
+      <w:numFmt w:val="bullet"/>
+      <w:lvlText w:val=""/>
+      <w:lvlJc w:val="left"/>
+      <w:pPr>
+        <w:tabs>
+          <w:tab w:val="num" w:pos="720"/>
+        </w:tabs>
+        <w:ind w:left="720" w:hanging="360"/>
+      </w:pPr>
+      <w:rPr>
+        <w:rFonts w:ascii="Symbol" w:hAnsi="Symbol" w:hint="default"/>
+        <w:sz w:val="20"/>
+      </w:rPr>
+    </w:lvl>
+    <w:lvl w:ilvl="1" w:tentative="1">
+      <w:start w:val="1"/>
+      <w:numFmt w:val="bullet"/>
+      <w:lvlText w:val="o"/>
+      <w:lvlJc w:val="left"/>
+      <w:pPr>
+        <w:tabs>
+          <w:tab w:val="num" w:pos="1440"/>
+        </w:tabs>
+        <w:ind w:left="1440" w:hanging="360"/>
+      </w:pPr>
+      <w:rPr>
+        <w:rFonts w:ascii="Courier New" w:hAnsi="Courier New" w:hint="default"/>
+        <w:sz w:val="20"/>
+      </w:rPr>
+    </w:lvl>
+    <w:lvl w:ilvl="2" w:tentative="1">
+      <w:start w:val="1"/>
+      <w:numFmt w:val="bullet"/>
+      <w:lvlText w:val=""/>
+      <w:lvlJc w:val="left"/>
+      <w:pPr>
+        <w:tabs>
+          <w:tab w:val="num" w:pos="2160"/>
+        </w:tabs>
+        <w:ind w:left="2160" w:hanging="360"/>
+      </w:pPr>
+      <w:rPr>
+        <w:rFonts w:ascii="Wingdings" w:hAnsi="Wingdings" w:hint="default"/>
+        <w:sz w:val="20"/>
+      </w:rPr>
+    </w:lvl>
+    <w:lvl w:ilvl="3" w:tentative="1">
+      <w:start w:val="1"/>
+      <w:numFmt w:val="bullet"/>
+      <w:lvlText w:val=""/>
+      <w:lvlJc w:val="left"/>
+      <w:pPr>
+        <w:tabs>
+          <w:tab w:val="num" w:pos="2880"/>
+        </w:tabs>
+        <w:ind w:left="2880" w:hanging="360"/>
+      </w:pPr>
+      <w:rPr>
+        <w:rFonts w:ascii="Wingdings" w:hAnsi="Wingdings" w:hint="default"/>
+        <w:sz w:val="20"/>
+      </w:rPr>
+    </w:lvl>
+    <w:lvl w:ilvl="4" w:tentative="1">
+      <w:start w:val="1"/>
+      <w:numFmt w:val="bullet"/>
+      <w:lvlText w:val=""/>
+      <w:lvlJc w:val="left"/>
+      <w:pPr>
+        <w:tabs>
+          <w:tab w:val="num" w:pos="3600"/>
+        </w:tabs>
+        <w:ind w:left="3600" w:hanging="360"/>
+      </w:pPr>
+      <w:rPr>
+        <w:rFonts w:ascii="Wingdings" w:hAnsi="Wingdings" w:hint="default"/>
+        <w:sz w:val="20"/>
+      </w:rPr>
+    </w:lvl>
+    <w:lvl w:ilvl="5" w:tentative="1">
+      <w:start w:val="1"/>
+      <w:numFmt w:val="bullet"/>
+      <w:lvlText w:val=""/>
+      <w:lvlJc w:val="left"/>
+      <w:pPr>
+        <w:tabs>
+          <w:tab w:val="num" w:pos="4320"/>
+        </w:tabs>
+        <w:ind w:left="4320" w:hanging="360"/>
+      </w:pPr>
+      <w:rPr>
+        <w:rFonts w:ascii="Wingdings" w:hAnsi="Wingdings" w:hint="default"/>
+        <w:sz w:val="20"/>
+      </w:rPr>
+    </w:lvl>
+    <w:lvl w:ilvl="6" w:tentative="1">
+      <w:start w:val="1"/>
+      <w:numFmt w:val="bullet"/>
+      <w:lvlText w:val=""/>
+      <w:lvlJc w:val="left"/>
+      <w:pPr>
+        <w:tabs>
+          <w:tab w:val="num" w:pos="5040"/>
+        </w:tabs>
+        <w:ind w:left="5040" w:hanging="360"/>
+      </w:pPr>
+      <w:rPr>
+        <w:rFonts w:ascii="Wingdings" w:hAnsi="Wingdings" w:hint="default"/>
+        <w:sz w:val="20"/>
+      </w:rPr>
+    </w:lvl>
+    <w:lvl w:ilvl="7" w:tentative="1">
+      <w:start w:val="1"/>
+      <w:numFmt w:val="bullet"/>
+      <w:lvlText w:val=""/>
+      <w:lvlJc w:val="left"/>
+      <w:pPr>
+        <w:tabs>
+          <w:tab w:val="num" w:pos="5760"/>
+        </w:tabs>
+        <w:ind w:left="5760" w:hanging="360"/>
+      </w:pPr>
+      <w:rPr>
+        <w:rFonts w:ascii="Wingdings" w:hAnsi="Wingdings" w:hint="default"/>
+        <w:sz w:val="20"/>
+      </w:rPr>
+    </w:lvl>
+    <w:lvl w:ilvl="8" w:tentative="1">
+      <w:start w:val="1"/>
+      <w:numFmt w:val="bullet"/>
+      <w:lvlText w:val=""/>
+      <w:lvlJc w:val="left"/>
+      <w:pPr>
+        <w:tabs>
+          <w:tab w:val="num" w:pos="6480"/>
+        </w:tabs>
+        <w:ind w:left="6480" w:hanging="360"/>
+      </w:pPr>
+      <w:rPr>
+        <w:rFonts w:ascii="Wingdings" w:hAnsi="Wingdings" w:hint="default"/>
+        <w:sz w:val="20"/>
+      </w:rPr>
+    </w:lvl>
+  </w:abstractNum>
+  <w:abstractNum w:abstractNumId="6" w15:restartNumberingAfterBreak="0">
     <w:nsid w:val="102505BA"/>
     <w:multiLevelType w:val="hybridMultilevel"/>
     <w:tmpl w:val="1BB66656"/>
@@ -11970,7 +13274,7 @@
       </w:rPr>
     </w:lvl>
   </w:abstractNum>
-  <w:abstractNum w:abstractNumId="6" w15:restartNumberingAfterBreak="0">
+  <w:abstractNum w:abstractNumId="7" w15:restartNumberingAfterBreak="0">
     <w:nsid w:val="13531B50"/>
     <w:multiLevelType w:val="hybridMultilevel"/>
     <w:tmpl w:val="163C4E26"/>
@@ -12083,7 +13387,7 @@
       </w:rPr>
     </w:lvl>
   </w:abstractNum>
-  <w:abstractNum w:abstractNumId="7" w15:restartNumberingAfterBreak="0">
+  <w:abstractNum w:abstractNumId="8" w15:restartNumberingAfterBreak="0">
     <w:nsid w:val="14890574"/>
     <w:multiLevelType w:val="hybridMultilevel"/>
     <w:tmpl w:val="C942867E"/>
@@ -12196,7 +13500,7 @@
       </w:rPr>
     </w:lvl>
   </w:abstractNum>
-  <w:abstractNum w:abstractNumId="8" w15:restartNumberingAfterBreak="0">
+  <w:abstractNum w:abstractNumId="9" w15:restartNumberingAfterBreak="0">
     <w:nsid w:val="149F4AD4"/>
     <w:multiLevelType w:val="hybridMultilevel"/>
     <w:tmpl w:val="52EEF330"/>
@@ -12308,7 +13612,7 @@
       </w:rPr>
     </w:lvl>
   </w:abstractNum>
-  <w:abstractNum w:abstractNumId="9" w15:restartNumberingAfterBreak="0">
+  <w:abstractNum w:abstractNumId="10" w15:restartNumberingAfterBreak="0">
     <w:nsid w:val="16992535"/>
     <w:multiLevelType w:val="multilevel"/>
     <w:tmpl w:val="3C4C8476"/>
@@ -12429,7 +13733,7 @@
       </w:rPr>
     </w:lvl>
   </w:abstractNum>
-  <w:abstractNum w:abstractNumId="10" w15:restartNumberingAfterBreak="0">
+  <w:abstractNum w:abstractNumId="11" w15:restartNumberingAfterBreak="0">
     <w:nsid w:val="17E73461"/>
     <w:multiLevelType w:val="multilevel"/>
     <w:tmpl w:val="46B01C02"/>
@@ -12578,7 +13882,7 @@
       </w:rPr>
     </w:lvl>
   </w:abstractNum>
-  <w:abstractNum w:abstractNumId="11" w15:restartNumberingAfterBreak="0">
+  <w:abstractNum w:abstractNumId="12" w15:restartNumberingAfterBreak="0">
     <w:nsid w:val="18622F86"/>
     <w:multiLevelType w:val="hybridMultilevel"/>
     <w:tmpl w:val="D62035DE"/>
@@ -12691,7 +13995,7 @@
       </w:rPr>
     </w:lvl>
   </w:abstractNum>
-  <w:abstractNum w:abstractNumId="12" w15:restartNumberingAfterBreak="0">
+  <w:abstractNum w:abstractNumId="13" w15:restartNumberingAfterBreak="0">
     <w:nsid w:val="1A556056"/>
     <w:multiLevelType w:val="hybridMultilevel"/>
     <w:tmpl w:val="3A0C5FBE"/>
@@ -12804,7 +14108,7 @@
       </w:rPr>
     </w:lvl>
   </w:abstractNum>
-  <w:abstractNum w:abstractNumId="13" w15:restartNumberingAfterBreak="0">
+  <w:abstractNum w:abstractNumId="14" w15:restartNumberingAfterBreak="0">
     <w:nsid w:val="1AD10C3F"/>
     <w:multiLevelType w:val="hybridMultilevel"/>
     <w:tmpl w:val="D9CCF9A4"/>
@@ -12917,7 +14221,7 @@
       </w:rPr>
     </w:lvl>
   </w:abstractNum>
-  <w:abstractNum w:abstractNumId="14" w15:restartNumberingAfterBreak="0">
+  <w:abstractNum w:abstractNumId="15" w15:restartNumberingAfterBreak="0">
     <w:nsid w:val="1D725B40"/>
     <w:multiLevelType w:val="hybridMultilevel"/>
     <w:tmpl w:val="79727038"/>
@@ -13029,7 +14333,7 @@
       </w:rPr>
     </w:lvl>
   </w:abstractNum>
-  <w:abstractNum w:abstractNumId="15" w15:restartNumberingAfterBreak="0">
+  <w:abstractNum w:abstractNumId="16" w15:restartNumberingAfterBreak="0">
     <w:nsid w:val="1F857B33"/>
     <w:multiLevelType w:val="hybridMultilevel"/>
     <w:tmpl w:val="6DC6C9CA"/>
@@ -13142,7 +14446,7 @@
       </w:rPr>
     </w:lvl>
   </w:abstractNum>
-  <w:abstractNum w:abstractNumId="16" w15:restartNumberingAfterBreak="0">
+  <w:abstractNum w:abstractNumId="17" w15:restartNumberingAfterBreak="0">
     <w:nsid w:val="22695CB2"/>
     <w:multiLevelType w:val="hybridMultilevel"/>
     <w:tmpl w:val="BCE29B30"/>
@@ -13255,7 +14559,7 @@
       </w:rPr>
     </w:lvl>
   </w:abstractNum>
-  <w:abstractNum w:abstractNumId="17" w15:restartNumberingAfterBreak="0">
+  <w:abstractNum w:abstractNumId="18" w15:restartNumberingAfterBreak="0">
     <w:nsid w:val="24697723"/>
     <w:multiLevelType w:val="hybridMultilevel"/>
     <w:tmpl w:val="79181DF8"/>
@@ -13366,7 +14670,7 @@
       </w:rPr>
     </w:lvl>
   </w:abstractNum>
-  <w:abstractNum w:abstractNumId="18" w15:restartNumberingAfterBreak="0">
+  <w:abstractNum w:abstractNumId="19" w15:restartNumberingAfterBreak="0">
     <w:nsid w:val="27A92871"/>
     <w:multiLevelType w:val="hybridMultilevel"/>
     <w:tmpl w:val="596019C2"/>
@@ -13478,7 +14782,7 @@
       </w:rPr>
     </w:lvl>
   </w:abstractNum>
-  <w:abstractNum w:abstractNumId="19" w15:restartNumberingAfterBreak="0">
+  <w:abstractNum w:abstractNumId="20" w15:restartNumberingAfterBreak="0">
     <w:nsid w:val="2A5B2595"/>
     <w:multiLevelType w:val="multilevel"/>
     <w:tmpl w:val="F2DEC4E8"/>
@@ -13627,7 +14931,7 @@
       </w:rPr>
     </w:lvl>
   </w:abstractNum>
-  <w:abstractNum w:abstractNumId="20" w15:restartNumberingAfterBreak="0">
+  <w:abstractNum w:abstractNumId="21" w15:restartNumberingAfterBreak="0">
     <w:nsid w:val="2B564343"/>
     <w:multiLevelType w:val="hybridMultilevel"/>
     <w:tmpl w:val="78EC6A0C"/>
@@ -13740,7 +15044,7 @@
       </w:rPr>
     </w:lvl>
   </w:abstractNum>
-  <w:abstractNum w:abstractNumId="21" w15:restartNumberingAfterBreak="0">
+  <w:abstractNum w:abstractNumId="22" w15:restartNumberingAfterBreak="0">
     <w:nsid w:val="2CA86F98"/>
     <w:multiLevelType w:val="hybridMultilevel"/>
     <w:tmpl w:val="1F546436"/>
@@ -13829,7 +15133,7 @@
       </w:pPr>
     </w:lvl>
   </w:abstractNum>
-  <w:abstractNum w:abstractNumId="22" w15:restartNumberingAfterBreak="0">
+  <w:abstractNum w:abstractNumId="23" w15:restartNumberingAfterBreak="0">
     <w:nsid w:val="2D816F04"/>
     <w:multiLevelType w:val="hybridMultilevel"/>
     <w:tmpl w:val="F4E6CCB0"/>
@@ -13942,7 +15246,7 @@
       </w:rPr>
     </w:lvl>
   </w:abstractNum>
-  <w:abstractNum w:abstractNumId="23" w15:restartNumberingAfterBreak="0">
+  <w:abstractNum w:abstractNumId="24" w15:restartNumberingAfterBreak="0">
     <w:nsid w:val="2E50001E"/>
     <w:multiLevelType w:val="hybridMultilevel"/>
     <w:tmpl w:val="71FAFD10"/>
@@ -14055,7 +15359,7 @@
       </w:rPr>
     </w:lvl>
   </w:abstractNum>
-  <w:abstractNum w:abstractNumId="24" w15:restartNumberingAfterBreak="0">
+  <w:abstractNum w:abstractNumId="25" w15:restartNumberingAfterBreak="0">
     <w:nsid w:val="30062529"/>
     <w:multiLevelType w:val="hybridMultilevel"/>
     <w:tmpl w:val="35F43F50"/>
@@ -14168,7 +15472,7 @@
       </w:rPr>
     </w:lvl>
   </w:abstractNum>
-  <w:abstractNum w:abstractNumId="25" w15:restartNumberingAfterBreak="0">
+  <w:abstractNum w:abstractNumId="26" w15:restartNumberingAfterBreak="0">
     <w:nsid w:val="34FC567F"/>
     <w:multiLevelType w:val="hybridMultilevel"/>
     <w:tmpl w:val="891EB89A"/>
@@ -14281,7 +15585,7 @@
       </w:rPr>
     </w:lvl>
   </w:abstractNum>
-  <w:abstractNum w:abstractNumId="26" w15:restartNumberingAfterBreak="0">
+  <w:abstractNum w:abstractNumId="27" w15:restartNumberingAfterBreak="0">
     <w:nsid w:val="35096B09"/>
     <w:multiLevelType w:val="hybridMultilevel"/>
     <w:tmpl w:val="0352D958"/>
@@ -14394,7 +15698,7 @@
       </w:rPr>
     </w:lvl>
   </w:abstractNum>
-  <w:abstractNum w:abstractNumId="27" w15:restartNumberingAfterBreak="0">
+  <w:abstractNum w:abstractNumId="28" w15:restartNumberingAfterBreak="0">
     <w:nsid w:val="379F14F4"/>
     <w:multiLevelType w:val="hybridMultilevel"/>
     <w:tmpl w:val="AB36D7BA"/>
@@ -14507,7 +15811,7 @@
       </w:rPr>
     </w:lvl>
   </w:abstractNum>
-  <w:abstractNum w:abstractNumId="28" w15:restartNumberingAfterBreak="0">
+  <w:abstractNum w:abstractNumId="29" w15:restartNumberingAfterBreak="0">
     <w:nsid w:val="38E863E3"/>
     <w:multiLevelType w:val="hybridMultilevel"/>
     <w:tmpl w:val="87EE4AB8"/>
@@ -14620,7 +15924,7 @@
       </w:rPr>
     </w:lvl>
   </w:abstractNum>
-  <w:abstractNum w:abstractNumId="29" w15:restartNumberingAfterBreak="0">
+  <w:abstractNum w:abstractNumId="30" w15:restartNumberingAfterBreak="0">
     <w:nsid w:val="3B4B799C"/>
     <w:multiLevelType w:val="hybridMultilevel"/>
     <w:tmpl w:val="AD6460B4"/>
@@ -14732,7 +16036,7 @@
       </w:rPr>
     </w:lvl>
   </w:abstractNum>
-  <w:abstractNum w:abstractNumId="30" w15:restartNumberingAfterBreak="0">
+  <w:abstractNum w:abstractNumId="31" w15:restartNumberingAfterBreak="0">
     <w:nsid w:val="3DD43B85"/>
     <w:multiLevelType w:val="hybridMultilevel"/>
     <w:tmpl w:val="727A302E"/>
@@ -14845,7 +16149,7 @@
       </w:rPr>
     </w:lvl>
   </w:abstractNum>
-  <w:abstractNum w:abstractNumId="31" w15:restartNumberingAfterBreak="0">
+  <w:abstractNum w:abstractNumId="32" w15:restartNumberingAfterBreak="0">
     <w:nsid w:val="3E447CD6"/>
     <w:multiLevelType w:val="multilevel"/>
     <w:tmpl w:val="50FAD7EE"/>
@@ -14964,7 +16268,7 @@
       </w:rPr>
     </w:lvl>
   </w:abstractNum>
-  <w:abstractNum w:abstractNumId="32" w15:restartNumberingAfterBreak="0">
+  <w:abstractNum w:abstractNumId="33" w15:restartNumberingAfterBreak="0">
     <w:nsid w:val="3F781E51"/>
     <w:multiLevelType w:val="hybridMultilevel"/>
     <w:tmpl w:val="56288EBA"/>
@@ -15076,7 +16380,7 @@
       </w:rPr>
     </w:lvl>
   </w:abstractNum>
-  <w:abstractNum w:abstractNumId="33" w15:restartNumberingAfterBreak="0">
+  <w:abstractNum w:abstractNumId="34" w15:restartNumberingAfterBreak="0">
     <w:nsid w:val="3FE503F6"/>
     <w:multiLevelType w:val="hybridMultilevel"/>
     <w:tmpl w:val="53E85D7C"/>
@@ -15189,7 +16493,7 @@
       </w:rPr>
     </w:lvl>
   </w:abstractNum>
-  <w:abstractNum w:abstractNumId="34" w15:restartNumberingAfterBreak="0">
+  <w:abstractNum w:abstractNumId="35" w15:restartNumberingAfterBreak="0">
     <w:nsid w:val="4038780B"/>
     <w:multiLevelType w:val="hybridMultilevel"/>
     <w:tmpl w:val="A6CEB7A6"/>
@@ -15301,7 +16605,7 @@
       </w:rPr>
     </w:lvl>
   </w:abstractNum>
-  <w:abstractNum w:abstractNumId="35" w15:restartNumberingAfterBreak="0">
+  <w:abstractNum w:abstractNumId="36" w15:restartNumberingAfterBreak="0">
     <w:nsid w:val="403B570A"/>
     <w:multiLevelType w:val="multilevel"/>
     <w:tmpl w:val="4BBCE916"/>
@@ -15422,7 +16726,7 @@
       </w:rPr>
     </w:lvl>
   </w:abstractNum>
-  <w:abstractNum w:abstractNumId="36" w15:restartNumberingAfterBreak="0">
+  <w:abstractNum w:abstractNumId="37" w15:restartNumberingAfterBreak="0">
     <w:nsid w:val="41BF7EDF"/>
     <w:multiLevelType w:val="hybridMultilevel"/>
     <w:tmpl w:val="F6F4B170"/>
@@ -15511,7 +16815,7 @@
       </w:pPr>
     </w:lvl>
   </w:abstractNum>
-  <w:abstractNum w:abstractNumId="37" w15:restartNumberingAfterBreak="0">
+  <w:abstractNum w:abstractNumId="38" w15:restartNumberingAfterBreak="0">
     <w:nsid w:val="43F25C4E"/>
     <w:multiLevelType w:val="hybridMultilevel"/>
     <w:tmpl w:val="D73801B8"/>
@@ -15624,7 +16928,7 @@
       </w:rPr>
     </w:lvl>
   </w:abstractNum>
-  <w:abstractNum w:abstractNumId="38" w15:restartNumberingAfterBreak="0">
+  <w:abstractNum w:abstractNumId="39" w15:restartNumberingAfterBreak="0">
     <w:nsid w:val="47E84501"/>
     <w:multiLevelType w:val="hybridMultilevel"/>
     <w:tmpl w:val="F5405C70"/>
@@ -15736,7 +17040,7 @@
       </w:rPr>
     </w:lvl>
   </w:abstractNum>
-  <w:abstractNum w:abstractNumId="39" w15:restartNumberingAfterBreak="0">
+  <w:abstractNum w:abstractNumId="40" w15:restartNumberingAfterBreak="0">
     <w:nsid w:val="49475A42"/>
     <w:multiLevelType w:val="hybridMultilevel"/>
     <w:tmpl w:val="C92E6650"/>
@@ -15825,7 +17129,7 @@
       </w:pPr>
     </w:lvl>
   </w:abstractNum>
-  <w:abstractNum w:abstractNumId="40" w15:restartNumberingAfterBreak="0">
+  <w:abstractNum w:abstractNumId="41" w15:restartNumberingAfterBreak="0">
     <w:nsid w:val="4A600DEB"/>
     <w:multiLevelType w:val="hybridMultilevel"/>
     <w:tmpl w:val="315883CC"/>
@@ -15938,7 +17242,7 @@
       </w:rPr>
     </w:lvl>
   </w:abstractNum>
-  <w:abstractNum w:abstractNumId="41" w15:restartNumberingAfterBreak="0">
+  <w:abstractNum w:abstractNumId="42" w15:restartNumberingAfterBreak="0">
     <w:nsid w:val="4CC73D94"/>
     <w:multiLevelType w:val="hybridMultilevel"/>
     <w:tmpl w:val="C16E405A"/>
@@ -16050,7 +17354,7 @@
       </w:rPr>
     </w:lvl>
   </w:abstractNum>
-  <w:abstractNum w:abstractNumId="42" w15:restartNumberingAfterBreak="0">
+  <w:abstractNum w:abstractNumId="43" w15:restartNumberingAfterBreak="0">
     <w:nsid w:val="4F1653B6"/>
     <w:multiLevelType w:val="multilevel"/>
     <w:tmpl w:val="59A68F72"/>
@@ -16199,7 +17503,120 @@
       </w:rPr>
     </w:lvl>
   </w:abstractNum>
-  <w:abstractNum w:abstractNumId="43" w15:restartNumberingAfterBreak="0">
+  <w:abstractNum w:abstractNumId="44" w15:restartNumberingAfterBreak="0">
+    <w:nsid w:val="4F4C5203"/>
+    <w:multiLevelType w:val="hybridMultilevel"/>
+    <w:tmpl w:val="735C18F8"/>
+    <w:lvl w:ilvl="0" w:tplc="0C0A0001">
+      <w:start w:val="1"/>
+      <w:numFmt w:val="bullet"/>
+      <w:lvlText w:val=""/>
+      <w:lvlJc w:val="left"/>
+      <w:pPr>
+        <w:ind w:left="720" w:hanging="360"/>
+      </w:pPr>
+      <w:rPr>
+        <w:rFonts w:ascii="Symbol" w:hAnsi="Symbol" w:hint="default"/>
+      </w:rPr>
+    </w:lvl>
+    <w:lvl w:ilvl="1" w:tplc="0C0A0003" w:tentative="1">
+      <w:start w:val="1"/>
+      <w:numFmt w:val="bullet"/>
+      <w:lvlText w:val="o"/>
+      <w:lvlJc w:val="left"/>
+      <w:pPr>
+        <w:ind w:left="1440" w:hanging="360"/>
+      </w:pPr>
+      <w:rPr>
+        <w:rFonts w:ascii="Courier New" w:hAnsi="Courier New" w:cs="Courier New" w:hint="default"/>
+      </w:rPr>
+    </w:lvl>
+    <w:lvl w:ilvl="2" w:tplc="0C0A0005" w:tentative="1">
+      <w:start w:val="1"/>
+      <w:numFmt w:val="bullet"/>
+      <w:lvlText w:val=""/>
+      <w:lvlJc w:val="left"/>
+      <w:pPr>
+        <w:ind w:left="2160" w:hanging="360"/>
+      </w:pPr>
+      <w:rPr>
+        <w:rFonts w:ascii="Wingdings" w:hAnsi="Wingdings" w:hint="default"/>
+      </w:rPr>
+    </w:lvl>
+    <w:lvl w:ilvl="3" w:tplc="0C0A0001" w:tentative="1">
+      <w:start w:val="1"/>
+      <w:numFmt w:val="bullet"/>
+      <w:lvlText w:val=""/>
+      <w:lvlJc w:val="left"/>
+      <w:pPr>
+        <w:ind w:left="2880" w:hanging="360"/>
+      </w:pPr>
+      <w:rPr>
+        <w:rFonts w:ascii="Symbol" w:hAnsi="Symbol" w:hint="default"/>
+      </w:rPr>
+    </w:lvl>
+    <w:lvl w:ilvl="4" w:tplc="0C0A0003" w:tentative="1">
+      <w:start w:val="1"/>
+      <w:numFmt w:val="bullet"/>
+      <w:lvlText w:val="o"/>
+      <w:lvlJc w:val="left"/>
+      <w:pPr>
+        <w:ind w:left="3600" w:hanging="360"/>
+      </w:pPr>
+      <w:rPr>
+        <w:rFonts w:ascii="Courier New" w:hAnsi="Courier New" w:cs="Courier New" w:hint="default"/>
+      </w:rPr>
+    </w:lvl>
+    <w:lvl w:ilvl="5" w:tplc="0C0A0005" w:tentative="1">
+      <w:start w:val="1"/>
+      <w:numFmt w:val="bullet"/>
+      <w:lvlText w:val=""/>
+      <w:lvlJc w:val="left"/>
+      <w:pPr>
+        <w:ind w:left="4320" w:hanging="360"/>
+      </w:pPr>
+      <w:rPr>
+        <w:rFonts w:ascii="Wingdings" w:hAnsi="Wingdings" w:hint="default"/>
+      </w:rPr>
+    </w:lvl>
+    <w:lvl w:ilvl="6" w:tplc="0C0A0001" w:tentative="1">
+      <w:start w:val="1"/>
+      <w:numFmt w:val="bullet"/>
+      <w:lvlText w:val=""/>
+      <w:lvlJc w:val="left"/>
+      <w:pPr>
+        <w:ind w:left="5040" w:hanging="360"/>
+      </w:pPr>
+      <w:rPr>
+        <w:rFonts w:ascii="Symbol" w:hAnsi="Symbol" w:hint="default"/>
+      </w:rPr>
+    </w:lvl>
+    <w:lvl w:ilvl="7" w:tplc="0C0A0003" w:tentative="1">
+      <w:start w:val="1"/>
+      <w:numFmt w:val="bullet"/>
+      <w:lvlText w:val="o"/>
+      <w:lvlJc w:val="left"/>
+      <w:pPr>
+        <w:ind w:left="5760" w:hanging="360"/>
+      </w:pPr>
+      <w:rPr>
+        <w:rFonts w:ascii="Courier New" w:hAnsi="Courier New" w:cs="Courier New" w:hint="default"/>
+      </w:rPr>
+    </w:lvl>
+    <w:lvl w:ilvl="8" w:tplc="0C0A0005" w:tentative="1">
+      <w:start w:val="1"/>
+      <w:numFmt w:val="bullet"/>
+      <w:lvlText w:val=""/>
+      <w:lvlJc w:val="left"/>
+      <w:pPr>
+        <w:ind w:left="6480" w:hanging="360"/>
+      </w:pPr>
+      <w:rPr>
+        <w:rFonts w:ascii="Wingdings" w:hAnsi="Wingdings" w:hint="default"/>
+      </w:rPr>
+    </w:lvl>
+  </w:abstractNum>
+  <w:abstractNum w:abstractNumId="45" w15:restartNumberingAfterBreak="0">
     <w:nsid w:val="514C1744"/>
     <w:multiLevelType w:val="hybridMultilevel"/>
     <w:tmpl w:val="721AEF52"/>
@@ -16311,7 +17728,7 @@
       </w:rPr>
     </w:lvl>
   </w:abstractNum>
-  <w:abstractNum w:abstractNumId="44" w15:restartNumberingAfterBreak="0">
+  <w:abstractNum w:abstractNumId="46" w15:restartNumberingAfterBreak="0">
     <w:nsid w:val="521E149F"/>
     <w:multiLevelType w:val="hybridMultilevel"/>
     <w:tmpl w:val="83EC5D0E"/>
@@ -16424,7 +17841,7 @@
       </w:rPr>
     </w:lvl>
   </w:abstractNum>
-  <w:abstractNum w:abstractNumId="45" w15:restartNumberingAfterBreak="0">
+  <w:abstractNum w:abstractNumId="47" w15:restartNumberingAfterBreak="0">
     <w:nsid w:val="569F5F63"/>
     <w:multiLevelType w:val="hybridMultilevel"/>
     <w:tmpl w:val="5400DE5C"/>
@@ -16537,7 +17954,7 @@
       </w:rPr>
     </w:lvl>
   </w:abstractNum>
-  <w:abstractNum w:abstractNumId="46" w15:restartNumberingAfterBreak="0">
+  <w:abstractNum w:abstractNumId="48" w15:restartNumberingAfterBreak="0">
     <w:nsid w:val="59EC0BE1"/>
     <w:multiLevelType w:val="multilevel"/>
     <w:tmpl w:val="B0CC2092"/>
@@ -16658,7 +18075,7 @@
       </w:rPr>
     </w:lvl>
   </w:abstractNum>
-  <w:abstractNum w:abstractNumId="47" w15:restartNumberingAfterBreak="0">
+  <w:abstractNum w:abstractNumId="49" w15:restartNumberingAfterBreak="0">
     <w:nsid w:val="5FA74BEA"/>
     <w:multiLevelType w:val="hybridMultilevel"/>
     <w:tmpl w:val="9372E894"/>
@@ -16771,7 +18188,7 @@
       </w:rPr>
     </w:lvl>
   </w:abstractNum>
-  <w:abstractNum w:abstractNumId="48" w15:restartNumberingAfterBreak="0">
+  <w:abstractNum w:abstractNumId="50" w15:restartNumberingAfterBreak="0">
     <w:nsid w:val="60E926BF"/>
     <w:multiLevelType w:val="hybridMultilevel"/>
     <w:tmpl w:val="28524892"/>
@@ -16884,7 +18301,7 @@
       </w:rPr>
     </w:lvl>
   </w:abstractNum>
-  <w:abstractNum w:abstractNumId="49" w15:restartNumberingAfterBreak="0">
+  <w:abstractNum w:abstractNumId="51" w15:restartNumberingAfterBreak="0">
     <w:nsid w:val="6161217B"/>
     <w:multiLevelType w:val="hybridMultilevel"/>
     <w:tmpl w:val="4F4A2E1A"/>
@@ -16997,7 +18414,7 @@
       </w:rPr>
     </w:lvl>
   </w:abstractNum>
-  <w:abstractNum w:abstractNumId="50" w15:restartNumberingAfterBreak="0">
+  <w:abstractNum w:abstractNumId="52" w15:restartNumberingAfterBreak="0">
     <w:nsid w:val="64AF5C87"/>
     <w:multiLevelType w:val="hybridMultilevel"/>
     <w:tmpl w:val="FFE45C8E"/>
@@ -17087,7 +18504,7 @@
       </w:pPr>
     </w:lvl>
   </w:abstractNum>
-  <w:abstractNum w:abstractNumId="51" w15:restartNumberingAfterBreak="0">
+  <w:abstractNum w:abstractNumId="53" w15:restartNumberingAfterBreak="0">
     <w:nsid w:val="68F306AB"/>
     <w:multiLevelType w:val="hybridMultilevel"/>
     <w:tmpl w:val="93489FB0"/>
@@ -17199,7 +18616,7 @@
       </w:rPr>
     </w:lvl>
   </w:abstractNum>
-  <w:abstractNum w:abstractNumId="52" w15:restartNumberingAfterBreak="0">
+  <w:abstractNum w:abstractNumId="54" w15:restartNumberingAfterBreak="0">
     <w:nsid w:val="6BBA1FD8"/>
     <w:multiLevelType w:val="hybridMultilevel"/>
     <w:tmpl w:val="7E66AB16"/>
@@ -17312,7 +18729,7 @@
       </w:rPr>
     </w:lvl>
   </w:abstractNum>
-  <w:abstractNum w:abstractNumId="53" w15:restartNumberingAfterBreak="0">
+  <w:abstractNum w:abstractNumId="55" w15:restartNumberingAfterBreak="0">
     <w:nsid w:val="6E074A1D"/>
     <w:multiLevelType w:val="hybridMultilevel"/>
     <w:tmpl w:val="F036C868"/>
@@ -17425,7 +18842,7 @@
       </w:rPr>
     </w:lvl>
   </w:abstractNum>
-  <w:abstractNum w:abstractNumId="54" w15:restartNumberingAfterBreak="0">
+  <w:abstractNum w:abstractNumId="56" w15:restartNumberingAfterBreak="0">
     <w:nsid w:val="749950A8"/>
     <w:multiLevelType w:val="hybridMultilevel"/>
     <w:tmpl w:val="1AD6E6B0"/>
@@ -17538,7 +18955,7 @@
       </w:rPr>
     </w:lvl>
   </w:abstractNum>
-  <w:abstractNum w:abstractNumId="55" w15:restartNumberingAfterBreak="0">
+  <w:abstractNum w:abstractNumId="57" w15:restartNumberingAfterBreak="0">
     <w:nsid w:val="78B5187C"/>
     <w:multiLevelType w:val="multilevel"/>
     <w:tmpl w:val="A95A603E"/>
@@ -17660,7 +19077,7 @@
       </w:rPr>
     </w:lvl>
   </w:abstractNum>
-  <w:abstractNum w:abstractNumId="56" w15:restartNumberingAfterBreak="0">
+  <w:abstractNum w:abstractNumId="58" w15:restartNumberingAfterBreak="0">
     <w:nsid w:val="7E281EB5"/>
     <w:multiLevelType w:val="hybridMultilevel"/>
     <w:tmpl w:val="661E1606"/>
@@ -17773,7 +19190,7 @@
       </w:rPr>
     </w:lvl>
   </w:abstractNum>
-  <w:abstractNum w:abstractNumId="57" w15:restartNumberingAfterBreak="0">
+  <w:abstractNum w:abstractNumId="59" w15:restartNumberingAfterBreak="0">
     <w:nsid w:val="7E8934ED"/>
     <w:multiLevelType w:val="hybridMultilevel"/>
     <w:tmpl w:val="FD08C17E"/>
@@ -17863,124 +19280,124 @@
     </w:lvl>
   </w:abstractNum>
   <w:num w:numId="1" w16cid:durableId="862520914">
-    <w:abstractNumId w:val="26"/>
+    <w:abstractNumId w:val="27"/>
   </w:num>
   <w:num w:numId="2" w16cid:durableId="704061785">
+    <w:abstractNumId w:val="14"/>
+  </w:num>
+  <w:num w:numId="3" w16cid:durableId="249848765">
+    <w:abstractNumId w:val="22"/>
+  </w:num>
+  <w:num w:numId="4" w16cid:durableId="87583927">
+    <w:abstractNumId w:val="56"/>
+  </w:num>
+  <w:num w:numId="5" w16cid:durableId="1252396376">
+    <w:abstractNumId w:val="7"/>
+  </w:num>
+  <w:num w:numId="6" w16cid:durableId="1892879420">
+    <w:abstractNumId w:val="58"/>
+  </w:num>
+  <w:num w:numId="7" w16cid:durableId="1471436671">
+    <w:abstractNumId w:val="51"/>
+  </w:num>
+  <w:num w:numId="8" w16cid:durableId="748117490">
+    <w:abstractNumId w:val="46"/>
+  </w:num>
+  <w:num w:numId="9" w16cid:durableId="512302927">
+    <w:abstractNumId w:val="50"/>
+  </w:num>
+  <w:num w:numId="10" w16cid:durableId="2020889208">
+    <w:abstractNumId w:val="16"/>
+  </w:num>
+  <w:num w:numId="11" w16cid:durableId="1279603909">
+    <w:abstractNumId w:val="29"/>
+  </w:num>
+  <w:num w:numId="12" w16cid:durableId="1601797218">
     <w:abstractNumId w:val="13"/>
   </w:num>
-  <w:num w:numId="3" w16cid:durableId="249848765">
-    <w:abstractNumId w:val="21"/>
+  <w:num w:numId="13" w16cid:durableId="521088784">
+    <w:abstractNumId w:val="38"/>
   </w:num>
-  <w:num w:numId="4" w16cid:durableId="87583927">
-    <w:abstractNumId w:val="54"/>
+  <w:num w:numId="14" w16cid:durableId="261961014">
+    <w:abstractNumId w:val="8"/>
   </w:num>
-  <w:num w:numId="5" w16cid:durableId="1252396376">
-    <w:abstractNumId w:val="6"/>
+  <w:num w:numId="15" w16cid:durableId="2001301453">
+    <w:abstractNumId w:val="47"/>
   </w:num>
-  <w:num w:numId="6" w16cid:durableId="1892879420">
-    <w:abstractNumId w:val="56"/>
-  </w:num>
-  <w:num w:numId="7" w16cid:durableId="1471436671">
-    <w:abstractNumId w:val="49"/>
-  </w:num>
-  <w:num w:numId="8" w16cid:durableId="748117490">
-    <w:abstractNumId w:val="44"/>
-  </w:num>
-  <w:num w:numId="9" w16cid:durableId="512302927">
-    <w:abstractNumId w:val="48"/>
-  </w:num>
-  <w:num w:numId="10" w16cid:durableId="2020889208">
-    <w:abstractNumId w:val="15"/>
-  </w:num>
-  <w:num w:numId="11" w16cid:durableId="1279603909">
-    <w:abstractNumId w:val="28"/>
-  </w:num>
-  <w:num w:numId="12" w16cid:durableId="1601797218">
+  <w:num w:numId="16" w16cid:durableId="796072621">
     <w:abstractNumId w:val="12"/>
   </w:num>
-  <w:num w:numId="13" w16cid:durableId="521088784">
-    <w:abstractNumId w:val="37"/>
-  </w:num>
-  <w:num w:numId="14" w16cid:durableId="261961014">
-    <w:abstractNumId w:val="7"/>
-  </w:num>
-  <w:num w:numId="15" w16cid:durableId="2001301453">
-    <w:abstractNumId w:val="45"/>
-  </w:num>
-  <w:num w:numId="16" w16cid:durableId="796072621">
-    <w:abstractNumId w:val="11"/>
-  </w:num>
   <w:num w:numId="17" w16cid:durableId="319120153">
-    <w:abstractNumId w:val="17"/>
+    <w:abstractNumId w:val="18"/>
   </w:num>
   <w:num w:numId="18" w16cid:durableId="776800243">
-    <w:abstractNumId w:val="18"/>
+    <w:abstractNumId w:val="19"/>
   </w:num>
   <w:num w:numId="19" w16cid:durableId="202792174">
-    <w:abstractNumId w:val="43"/>
+    <w:abstractNumId w:val="45"/>
   </w:num>
   <w:num w:numId="20" w16cid:durableId="1753500636">
     <w:abstractNumId w:val="3"/>
   </w:num>
   <w:num w:numId="21" w16cid:durableId="322710021">
-    <w:abstractNumId w:val="41"/>
+    <w:abstractNumId w:val="42"/>
   </w:num>
   <w:num w:numId="22" w16cid:durableId="1801410820">
-    <w:abstractNumId w:val="23"/>
+    <w:abstractNumId w:val="24"/>
   </w:num>
   <w:num w:numId="23" w16cid:durableId="28990783">
     <w:abstractNumId w:val="2"/>
   </w:num>
   <w:num w:numId="24" w16cid:durableId="1362972727">
-    <w:abstractNumId w:val="14"/>
+    <w:abstractNumId w:val="15"/>
   </w:num>
   <w:num w:numId="25" w16cid:durableId="2111387539">
-    <w:abstractNumId w:val="34"/>
+    <w:abstractNumId w:val="35"/>
   </w:num>
   <w:num w:numId="26" w16cid:durableId="828208934">
-    <w:abstractNumId w:val="51"/>
+    <w:abstractNumId w:val="53"/>
   </w:num>
   <w:num w:numId="27" w16cid:durableId="28990856">
-    <w:abstractNumId w:val="32"/>
+    <w:abstractNumId w:val="33"/>
   </w:num>
   <w:num w:numId="28" w16cid:durableId="201985131">
-    <w:abstractNumId w:val="8"/>
+    <w:abstractNumId w:val="9"/>
   </w:num>
   <w:num w:numId="29" w16cid:durableId="1766919014">
     <w:abstractNumId w:val="0"/>
   </w:num>
   <w:num w:numId="30" w16cid:durableId="479539775">
-    <w:abstractNumId w:val="57"/>
+    <w:abstractNumId w:val="59"/>
   </w:num>
   <w:num w:numId="31" w16cid:durableId="1804231253">
-    <w:abstractNumId w:val="9"/>
+    <w:abstractNumId w:val="10"/>
   </w:num>
   <w:num w:numId="32" w16cid:durableId="1692565318">
-    <w:abstractNumId w:val="35"/>
+    <w:abstractNumId w:val="36"/>
   </w:num>
   <w:num w:numId="33" w16cid:durableId="512305008">
-    <w:abstractNumId w:val="31"/>
+    <w:abstractNumId w:val="32"/>
   </w:num>
   <w:num w:numId="34" w16cid:durableId="2038043317">
-    <w:abstractNumId w:val="39"/>
+    <w:abstractNumId w:val="40"/>
   </w:num>
   <w:num w:numId="35" w16cid:durableId="417605297">
-    <w:abstractNumId w:val="46"/>
+    <w:abstractNumId w:val="48"/>
   </w:num>
   <w:num w:numId="36" w16cid:durableId="1034816882">
-    <w:abstractNumId w:val="36"/>
+    <w:abstractNumId w:val="37"/>
   </w:num>
   <w:num w:numId="37" w16cid:durableId="640962694">
-    <w:abstractNumId w:val="55"/>
+    <w:abstractNumId w:val="57"/>
   </w:num>
   <w:num w:numId="38" w16cid:durableId="587538763">
     <w:abstractNumId w:val="1"/>
   </w:num>
   <w:num w:numId="39" w16cid:durableId="1993216330">
-    <w:abstractNumId w:val="50"/>
+    <w:abstractNumId w:val="52"/>
   </w:num>
   <w:num w:numId="40" w16cid:durableId="1589848165">
-    <w:abstractNumId w:val="55"/>
+    <w:abstractNumId w:val="57"/>
     <w:lvlOverride w:ilvl="0">
       <w:startOverride w:val="1"/>
     </w:lvlOverride>
@@ -17992,28 +19409,28 @@
     </w:lvlOverride>
   </w:num>
   <w:num w:numId="41" w16cid:durableId="1328174115">
-    <w:abstractNumId w:val="55"/>
+    <w:abstractNumId w:val="57"/>
     <w:lvlOverride w:ilvl="0">
       <w:startOverride w:val="1"/>
     </w:lvlOverride>
   </w:num>
   <w:num w:numId="42" w16cid:durableId="1915431396">
-    <w:abstractNumId w:val="47"/>
+    <w:abstractNumId w:val="49"/>
   </w:num>
   <w:num w:numId="43" w16cid:durableId="1093235627">
-    <w:abstractNumId w:val="29"/>
+    <w:abstractNumId w:val="30"/>
   </w:num>
   <w:num w:numId="44" w16cid:durableId="1524899554">
-    <w:abstractNumId w:val="19"/>
+    <w:abstractNumId w:val="20"/>
   </w:num>
   <w:num w:numId="45" w16cid:durableId="886140364">
-    <w:abstractNumId w:val="42"/>
+    <w:abstractNumId w:val="43"/>
   </w:num>
   <w:num w:numId="46" w16cid:durableId="1619722878">
-    <w:abstractNumId w:val="20"/>
+    <w:abstractNumId w:val="21"/>
   </w:num>
   <w:num w:numId="47" w16cid:durableId="269091334">
-    <w:abstractNumId w:val="31"/>
+    <w:abstractNumId w:val="32"/>
     <w:lvlOverride w:ilvl="0">
       <w:startOverride w:val="1"/>
     </w:lvlOverride>
@@ -18043,10 +19460,10 @@
     </w:lvlOverride>
   </w:num>
   <w:num w:numId="48" w16cid:durableId="1010375684">
-    <w:abstractNumId w:val="40"/>
+    <w:abstractNumId w:val="41"/>
   </w:num>
   <w:num w:numId="49" w16cid:durableId="1780104848">
-    <w:abstractNumId w:val="55"/>
+    <w:abstractNumId w:val="57"/>
     <w:lvlOverride w:ilvl="0">
       <w:startOverride w:val="1"/>
     </w:lvlOverride>
@@ -18055,43 +19472,43 @@
     </w:lvlOverride>
   </w:num>
   <w:num w:numId="50" w16cid:durableId="1089622058">
-    <w:abstractNumId w:val="33"/>
+    <w:abstractNumId w:val="34"/>
   </w:num>
   <w:num w:numId="51" w16cid:durableId="618534554">
-    <w:abstractNumId w:val="24"/>
+    <w:abstractNumId w:val="25"/>
   </w:num>
   <w:num w:numId="52" w16cid:durableId="866799280">
-    <w:abstractNumId w:val="16"/>
+    <w:abstractNumId w:val="17"/>
   </w:num>
   <w:num w:numId="53" w16cid:durableId="1049959823">
-    <w:abstractNumId w:val="55"/>
+    <w:abstractNumId w:val="57"/>
   </w:num>
   <w:num w:numId="54" w16cid:durableId="1341158039">
-    <w:abstractNumId w:val="30"/>
+    <w:abstractNumId w:val="31"/>
   </w:num>
   <w:num w:numId="55" w16cid:durableId="445078187">
-    <w:abstractNumId w:val="52"/>
+    <w:abstractNumId w:val="54"/>
   </w:num>
   <w:num w:numId="56" w16cid:durableId="2081100912">
-    <w:abstractNumId w:val="10"/>
+    <w:abstractNumId w:val="11"/>
   </w:num>
   <w:num w:numId="57" w16cid:durableId="118115163">
     <w:abstractNumId w:val="4"/>
   </w:num>
   <w:num w:numId="58" w16cid:durableId="1573739160">
-    <w:abstractNumId w:val="25"/>
+    <w:abstractNumId w:val="26"/>
   </w:num>
   <w:num w:numId="59" w16cid:durableId="454833677">
-    <w:abstractNumId w:val="38"/>
+    <w:abstractNumId w:val="39"/>
   </w:num>
   <w:num w:numId="60" w16cid:durableId="1594825392">
-    <w:abstractNumId w:val="53"/>
+    <w:abstractNumId w:val="55"/>
   </w:num>
   <w:num w:numId="61" w16cid:durableId="1597203603">
-    <w:abstractNumId w:val="22"/>
+    <w:abstractNumId w:val="23"/>
   </w:num>
   <w:num w:numId="62" w16cid:durableId="1941526792">
-    <w:abstractNumId w:val="55"/>
+    <w:abstractNumId w:val="57"/>
     <w:lvlOverride w:ilvl="0">
       <w:startOverride w:val="2"/>
     </w:lvlOverride>
@@ -18100,7 +19517,7 @@
     </w:lvlOverride>
   </w:num>
   <w:num w:numId="63" w16cid:durableId="1016152710">
-    <w:abstractNumId w:val="55"/>
+    <w:abstractNumId w:val="57"/>
     <w:lvlOverride w:ilvl="0">
       <w:startOverride w:val="2"/>
     </w:lvlOverride>
@@ -18112,7 +19529,7 @@
     </w:lvlOverride>
   </w:num>
   <w:num w:numId="64" w16cid:durableId="1036199280">
-    <w:abstractNumId w:val="55"/>
+    <w:abstractNumId w:val="57"/>
     <w:lvlOverride w:ilvl="0">
       <w:startOverride w:val="2"/>
     </w:lvlOverride>
@@ -18124,10 +19541,16 @@
     </w:lvlOverride>
   </w:num>
   <w:num w:numId="65" w16cid:durableId="1805386656">
-    <w:abstractNumId w:val="27"/>
+    <w:abstractNumId w:val="28"/>
   </w:num>
   <w:num w:numId="66" w16cid:durableId="1546597375">
+    <w:abstractNumId w:val="6"/>
+  </w:num>
+  <w:num w:numId="67" w16cid:durableId="362830303">
     <w:abstractNumId w:val="5"/>
+  </w:num>
+  <w:num w:numId="68" w16cid:durableId="990988292">
+    <w:abstractNumId w:val="44"/>
   </w:num>
 </w:numbering>
 </file>

</xml_diff>